<commit_message>
Update Lab 01 report
</commit_message>
<xml_diff>
--- a/LAB 01/Lab01_Computer_Vision_Report.docx
+++ b/LAB 01/Lab01_Computer_Vision_Report.docx
@@ -4,26 +4,93 @@
   <w:body>
     <w:p>
       <w:pPr>
-        <w:spacing w:before="1512"/>
+        <w:spacing w:before="1500" w:after="40"/>
         <w:jc w:val="center"/>
       </w:pPr>
+      <w:r>
+        <w:rPr>
+          <w:noProof/>
+        </w:rPr>
+        <w:drawing>
+          <wp:anchor distT="0" distB="0" distL="114300" distR="114300" simplePos="0" relativeHeight="251658240" behindDoc="1" locked="0" layoutInCell="1" allowOverlap="1" wp14:anchorId="65C06192" wp14:editId="74D7741F">
+            <wp:simplePos x="0" y="0"/>
+            <wp:positionH relativeFrom="column">
+              <wp:posOffset>2200275</wp:posOffset>
+            </wp:positionH>
+            <wp:positionV relativeFrom="paragraph">
+              <wp:posOffset>-657225</wp:posOffset>
+            </wp:positionV>
+            <wp:extent cx="1543050" cy="1465580"/>
+            <wp:effectExtent l="0" t="0" r="0" b="1270"/>
+            <wp:wrapTight wrapText="bothSides">
+              <wp:wrapPolygon edited="0">
+                <wp:start x="0" y="0"/>
+                <wp:lineTo x="0" y="21338"/>
+                <wp:lineTo x="21333" y="21338"/>
+                <wp:lineTo x="21333" y="0"/>
+                <wp:lineTo x="0" y="0"/>
+              </wp:wrapPolygon>
+            </wp:wrapTight>
+            <wp:docPr id="1281400099" name="Picture 1"/>
+            <wp:cNvGraphicFramePr>
+              <a:graphicFrameLocks xmlns:a="http://schemas.openxmlformats.org/drawingml/2006/main" noChangeAspect="1"/>
+            </wp:cNvGraphicFramePr>
+            <a:graphic xmlns:a="http://schemas.openxmlformats.org/drawingml/2006/main">
+              <a:graphicData uri="http://schemas.openxmlformats.org/drawingml/2006/picture">
+                <pic:pic xmlns:pic="http://schemas.openxmlformats.org/drawingml/2006/picture">
+                  <pic:nvPicPr>
+                    <pic:cNvPr id="1281400099" name=""/>
+                    <pic:cNvPicPr/>
+                  </pic:nvPicPr>
+                  <pic:blipFill>
+                    <a:blip r:embed="rId8"/>
+                    <a:stretch>
+                      <a:fillRect/>
+                    </a:stretch>
+                  </pic:blipFill>
+                  <pic:spPr>
+                    <a:xfrm>
+                      <a:off x="0" y="0"/>
+                      <a:ext cx="1543050" cy="1465580"/>
+                    </a:xfrm>
+                    <a:prstGeom prst="rect">
+                      <a:avLst/>
+                    </a:prstGeom>
+                  </pic:spPr>
+                </pic:pic>
+              </a:graphicData>
+            </a:graphic>
+            <wp14:sizeRelH relativeFrom="margin">
+              <wp14:pctWidth>0</wp14:pctWidth>
+            </wp14:sizeRelH>
+            <wp14:sizeRelV relativeFrom="margin">
+              <wp14:pctHeight>0</wp14:pctHeight>
+            </wp14:sizeRelV>
+          </wp:anchor>
+        </w:drawing>
+      </w:r>
       <w:r>
         <w:rPr>
           <w:b/>
           <w:color w:val="1F3A5F"/>
-          <w:sz w:val="30"/>
+          <w:spacing w:val="40"/>
+          <w:sz w:val="32"/>
         </w:rPr>
         <w:t>AIN SHAMS UNIVERSITY</w:t>
       </w:r>
     </w:p>
     <w:p>
       <w:pPr>
+        <w:pBdr>
+          <w:bottom w:val="single" w:sz="12" w:space="10" w:color="1F3A5F"/>
+        </w:pBdr>
+        <w:spacing w:after="1400"/>
         <w:jc w:val="center"/>
       </w:pPr>
       <w:r>
         <w:rPr>
-          <w:b/>
-          <w:color w:val="536273"/>
+          <w:color w:val="595959"/>
+          <w:spacing w:val="30"/>
           <w:sz w:val="24"/>
         </w:rPr>
         <w:t>FACULTY OF ENGINEERING</w:t>
@@ -31,129 +98,203 @@
     </w:p>
     <w:p>
       <w:pPr>
-        <w:spacing w:before="960"/>
+        <w:spacing w:line="240" w:lineRule="auto"/>
         <w:jc w:val="center"/>
       </w:pPr>
       <w:r>
         <w:rPr>
           <w:b/>
           <w:color w:val="1F3A5F"/>
-          <w:sz w:val="50"/>
+          <w:sz w:val="56"/>
         </w:rPr>
         <w:t>Computer Vision Lab Assignment 01</w:t>
       </w:r>
     </w:p>
     <w:p>
       <w:pPr>
-        <w:spacing w:after="840"/>
+        <w:spacing w:after="360"/>
         <w:jc w:val="center"/>
       </w:pPr>
       <w:r>
         <w:rPr>
-          <w:color w:val="3D7E80"/>
-          <w:sz w:val="30"/>
+          <w:color w:val="2F5D8A"/>
+          <w:sz w:val="32"/>
         </w:rPr>
         <w:t>OpenCV Image Processing</w:t>
       </w:r>
     </w:p>
     <w:p>
       <w:pPr>
+        <w:spacing w:after="40"/>
         <w:jc w:val="center"/>
       </w:pPr>
       <w:r>
-        <w:t>CSE480 / CSE482 Lab</w:t>
+        <w:rPr>
+          <w:sz w:val="24"/>
+        </w:rPr>
+        <w:t>CSE480 / CSE482 Computer Vision Lab</w:t>
       </w:r>
     </w:p>
     <w:p>
       <w:pPr>
+        <w:spacing w:after="1200"/>
         <w:jc w:val="center"/>
       </w:pPr>
       <w:r>
+        <w:rPr>
+          <w:color w:val="595959"/>
+          <w:sz w:val="24"/>
+        </w:rPr>
         <w:t>Mechatronics Engineering and Automation Program</w:t>
       </w:r>
     </w:p>
     <w:p>
       <w:pPr>
-        <w:spacing w:before="680"/>
+        <w:keepNext/>
         <w:jc w:val="center"/>
       </w:pPr>
       <w:r>
         <w:rPr>
           <w:b/>
-          <w:color w:val="536273"/>
+          <w:color w:val="595959"/>
+          <w:spacing w:val="30"/>
           <w:sz w:val="20"/>
         </w:rPr>
-        <w:t>Prepared by</w:t>
+        <w:t>PREPARED BY</w:t>
       </w:r>
     </w:p>
+    <w:tbl>
+      <w:tblPr>
+        <w:tblW w:w="6600" w:type="dxa"/>
+        <w:jc w:val="center"/>
+        <w:tblBorders>
+          <w:top w:val="single" w:sz="4" w:space="0" w:color="auto"/>
+          <w:left w:val="single" w:sz="4" w:space="0" w:color="auto"/>
+          <w:bottom w:val="single" w:sz="4" w:space="0" w:color="auto"/>
+          <w:right w:val="single" w:sz="4" w:space="0" w:color="auto"/>
+          <w:insideH w:val="single" w:sz="4" w:space="0" w:color="auto"/>
+          <w:insideV w:val="single" w:sz="4" w:space="0" w:color="auto"/>
+        </w:tblBorders>
+        <w:tblLayout w:type="fixed"/>
+        <w:tblCellMar>
+          <w:left w:w="120" w:type="dxa"/>
+          <w:right w:w="120" w:type="dxa"/>
+        </w:tblCellMar>
+        <w:tblLook w:val="04A0" w:firstRow="1" w:lastRow="0" w:firstColumn="1" w:lastColumn="0" w:noHBand="0" w:noVBand="1"/>
+      </w:tblPr>
+      <w:tblGrid>
+        <w:gridCol w:w="2200"/>
+        <w:gridCol w:w="4400"/>
+      </w:tblGrid>
+      <w:tr>
+        <w:trPr>
+          <w:cantSplit/>
+          <w:jc w:val="center"/>
+        </w:trPr>
+        <w:tc>
+          <w:tcPr>
+            <w:tcW w:w="2200" w:type="dxa"/>
+            <w:vAlign w:val="center"/>
+          </w:tcPr>
+          <w:p>
+            <w:pPr>
+              <w:spacing w:before="100" w:after="100"/>
+              <w:jc w:val="left"/>
+            </w:pPr>
+            <w:r>
+              <w:rPr>
+                <w:b/>
+                <w:color w:val="1F3A5F"/>
+                <w:sz w:val="23"/>
+              </w:rPr>
+              <w:t>Student Name</w:t>
+            </w:r>
+          </w:p>
+        </w:tc>
+        <w:tc>
+          <w:tcPr>
+            <w:tcW w:w="4400" w:type="dxa"/>
+            <w:vAlign w:val="center"/>
+          </w:tcPr>
+          <w:p>
+            <w:pPr>
+              <w:spacing w:before="100" w:after="100"/>
+              <w:jc w:val="left"/>
+            </w:pPr>
+            <w:r>
+              <w:rPr>
+                <w:sz w:val="23"/>
+              </w:rPr>
+              <w:t>Kerolus Hany Rabie Hana</w:t>
+            </w:r>
+          </w:p>
+        </w:tc>
+      </w:tr>
+      <w:tr>
+        <w:trPr>
+          <w:cantSplit/>
+          <w:jc w:val="center"/>
+        </w:trPr>
+        <w:tc>
+          <w:tcPr>
+            <w:tcW w:w="2200" w:type="dxa"/>
+            <w:vAlign w:val="center"/>
+          </w:tcPr>
+          <w:p>
+            <w:pPr>
+              <w:spacing w:before="100" w:after="100"/>
+              <w:jc w:val="left"/>
+            </w:pPr>
+            <w:r>
+              <w:rPr>
+                <w:b/>
+                <w:color w:val="1F3A5F"/>
+                <w:sz w:val="23"/>
+              </w:rPr>
+              <w:t>Student ID</w:t>
+            </w:r>
+          </w:p>
+        </w:tc>
+        <w:tc>
+          <w:tcPr>
+            <w:tcW w:w="4400" w:type="dxa"/>
+            <w:vAlign w:val="center"/>
+          </w:tcPr>
+          <w:p>
+            <w:pPr>
+              <w:spacing w:before="100" w:after="100"/>
+              <w:jc w:val="left"/>
+            </w:pPr>
+            <w:r>
+              <w:rPr>
+                <w:sz w:val="23"/>
+              </w:rPr>
+              <w:t>22P0134</w:t>
+            </w:r>
+          </w:p>
+        </w:tc>
+      </w:tr>
+    </w:tbl>
     <w:p>
       <w:pPr>
-        <w:jc w:val="center"/>
-      </w:pPr>
-      <w:r>
-        <w:t xml:space="preserve">Student </w:t>
-      </w:r>
-      <w:proofErr w:type="gramStart"/>
-      <w:r>
-        <w:t>Name: _</w:t>
-      </w:r>
-      <w:proofErr w:type="gramEnd"/>
-      <w:r>
-        <w:t>______________</w:t>
-      </w:r>
-      <w:r>
-        <w:t xml:space="preserve">Kerolus Hany Rabie Hana </w:t>
-      </w:r>
-      <w:r>
-        <w:t>___________________</w:t>
-      </w:r>
+        <w:spacing w:after="0"/>
+        <w:sectPr>
+          <w:pgSz w:w="12240" w:h="15840"/>
+          <w:pgMar w:top="1440" w:right="1440" w:bottom="1440" w:left="1440" w:header="720" w:footer="720" w:gutter="0"/>
+          <w:cols w:space="720"/>
+        </w:sectPr>
+      </w:pPr>
     </w:p>
     <w:p>
       <w:pPr>
-        <w:jc w:val="center"/>
+        <w:pStyle w:val="Heading1"/>
       </w:pPr>
       <w:r>
-        <w:t>Student ID: ________________</w:t>
-      </w:r>
-      <w:r>
-        <w:t>22P0134</w:t>
-      </w:r>
-      <w:r>
-        <w:t>____________________</w:t>
-      </w:r>
-    </w:p>
-    <w:p>
-      <w:pPr>
-        <w:spacing w:before="480"/>
-        <w:jc w:val="center"/>
-      </w:pPr>
-      <w:r>
-        <w:t>Fall 2026</w:t>
-      </w:r>
-    </w:p>
-    <w:p>
-      <w:r>
-        <w:br w:type="page"/>
-      </w:r>
-    </w:p>
-    <w:p>
-      <w:pPr>
-        <w:pStyle w:val="Heading1"/>
-        <w:spacing w:before="200" w:after="80"/>
-      </w:pPr>
-      <w:r>
-        <w:rPr>
-          <w:rFonts w:ascii="Aptos Display" w:hAnsi="Aptos Display"/>
-          <w:sz w:val="32"/>
-        </w:rPr>
         <w:lastRenderedPageBreak/>
         <w:t>1. Introduction</w:t>
       </w:r>
     </w:p>
     <w:p>
-      <w:pPr>
-        <w:spacing w:after="100" w:line="259" w:lineRule="auto"/>
-      </w:pPr>
       <w:r>
         <w:t>This report presents four image-processing tasks completed with Python, OpenCV, and NumPy. The tasks demonstrate selective colour isolation, weighted image blending, vignette filtering, and channel swapping. Each section states the objective, explains the processing steps, includes the code, and presents the resulting images.</w:t>
       </w:r>
@@ -161,233 +302,187 @@
     <w:p>
       <w:pPr>
         <w:pStyle w:val="Heading1"/>
-        <w:spacing w:before="200" w:after="80"/>
       </w:pPr>
       <w:r>
-        <w:rPr>
-          <w:rFonts w:ascii="Aptos Display" w:hAnsi="Aptos Display"/>
-          <w:sz w:val="32"/>
-        </w:rPr>
         <w:t>2. Tasks and Workflow</w:t>
       </w:r>
     </w:p>
     <w:p>
-      <w:pPr>
-        <w:spacing w:after="100" w:line="259" w:lineRule="auto"/>
-      </w:pPr>
       <w:r>
-        <w:t>The supplied apple, cameraman, zebra, and Mars rover images are loaded in OpenCV's BGR format. Each task writes its processed result to a results folder. The notebook uses cv2_imshow for inline display in Google Colab.</w:t>
+        <w:t xml:space="preserve">The supplied apple, cameraman, zebra, and Mars rover images are loaded in OpenCV's BGR format. Each task writes its processed result to a results folder. The notebook uses </w:t>
+      </w:r>
+      <w:r>
+        <w:rPr>
+          <w:rStyle w:val="InlineCode"/>
+        </w:rPr>
+        <w:t>cv2_imshow</w:t>
+      </w:r>
+      <w:r>
+        <w:t xml:space="preserve"> for inline display in Google Colab.</w:t>
       </w:r>
     </w:p>
     <w:p>
       <w:pPr>
         <w:pStyle w:val="Heading2"/>
-        <w:spacing w:before="120" w:after="80"/>
       </w:pPr>
       <w:r>
-        <w:rPr>
-          <w:rFonts w:ascii="Aptos Display" w:hAnsi="Aptos Display"/>
-          <w:color w:val="3D7E80"/>
-          <w:sz w:val="24"/>
-        </w:rPr>
-        <w:t>Common setup code</w:t>
+        <w:t>2.1 Common Setup Code</w:t>
       </w:r>
     </w:p>
     <w:p>
       <w:pPr>
-        <w:shd w:val="clear" w:color="auto" w:fill="F3F6F8"/>
-        <w:spacing w:after="120" w:line="240" w:lineRule="auto"/>
-        <w:ind w:left="173"/>
+        <w:pStyle w:val="CodeBlock"/>
+        <w:keepNext/>
+        <w:keepLines/>
+        <w:spacing w:before="60"/>
       </w:pPr>
       <w:r>
-        <w:rPr>
-          <w:rFonts w:ascii="Consolas" w:hAnsi="Consolas"/>
-          <w:color w:val="1C2B39"/>
-          <w:sz w:val="15"/>
-        </w:rPr>
         <w:t>import cv2</w:t>
       </w:r>
+    </w:p>
+    <w:p>
+      <w:pPr>
+        <w:pStyle w:val="CodeBlock"/>
+        <w:keepNext/>
+        <w:keepLines/>
+      </w:pPr>
       <w:r>
-        <w:br/>
-      </w:r>
-      <w:r>
-        <w:rPr>
-          <w:rFonts w:ascii="Consolas" w:hAnsi="Consolas"/>
-          <w:color w:val="1C2B39"/>
-          <w:sz w:val="15"/>
-        </w:rPr>
         <w:t>import numpy as np</w:t>
       </w:r>
+    </w:p>
+    <w:p>
+      <w:pPr>
+        <w:pStyle w:val="CodeBlock"/>
+        <w:keepNext/>
+        <w:keepLines/>
+      </w:pPr>
       <w:r>
-        <w:br/>
-      </w:r>
-      <w:r>
-        <w:rPr>
-          <w:rFonts w:ascii="Consolas" w:hAnsi="Consolas"/>
-          <w:color w:val="1C2B39"/>
-          <w:sz w:val="15"/>
-        </w:rPr>
         <w:t>from pathlib import Path</w:t>
       </w:r>
+    </w:p>
+    <w:p>
+      <w:pPr>
+        <w:pStyle w:val="CodeBlock"/>
+        <w:keepNext/>
+        <w:keepLines/>
+      </w:pPr>
       <w:r>
-        <w:br/>
-      </w:r>
-      <w:r>
-        <w:rPr>
-          <w:rFonts w:ascii="Consolas" w:hAnsi="Consolas"/>
-          <w:color w:val="1C2B39"/>
-          <w:sz w:val="15"/>
-        </w:rPr>
         <w:t>from google.colab.patches import cv2_imshow</w:t>
       </w:r>
+    </w:p>
+    <w:p>
+      <w:pPr>
+        <w:pStyle w:val="CodeBlock"/>
+        <w:keepNext/>
+        <w:keepLines/>
+      </w:pPr>
+    </w:p>
+    <w:p>
+      <w:pPr>
+        <w:pStyle w:val="CodeBlock"/>
+        <w:keepNext/>
+        <w:keepLines/>
+      </w:pPr>
       <w:r>
-        <w:br/>
-      </w:r>
-      <w:r>
-        <w:rPr>
-          <w:rFonts w:ascii="Consolas" w:hAnsi="Consolas"/>
-          <w:color w:val="1C2B39"/>
-          <w:sz w:val="15"/>
-        </w:rPr>
-        <w:t xml:space="preserve"> </w:t>
-      </w:r>
-      <w:r>
-        <w:br/>
-      </w:r>
-      <w:r>
-        <w:rPr>
-          <w:rFonts w:ascii="Consolas" w:hAnsi="Consolas"/>
-          <w:color w:val="1C2B39"/>
-          <w:sz w:val="15"/>
-        </w:rPr>
         <w:t>image_dir = Path(".")</w:t>
       </w:r>
+    </w:p>
+    <w:p>
+      <w:pPr>
+        <w:pStyle w:val="CodeBlock"/>
+        <w:keepNext/>
+        <w:keepLines/>
+      </w:pPr>
       <w:r>
-        <w:br/>
-      </w:r>
-      <w:r>
-        <w:rPr>
-          <w:rFonts w:ascii="Consolas" w:hAnsi="Consolas"/>
-          <w:color w:val="1C2B39"/>
-          <w:sz w:val="15"/>
-        </w:rPr>
         <w:t>output_dir = Path("results")</w:t>
       </w:r>
+    </w:p>
+    <w:p>
+      <w:pPr>
+        <w:pStyle w:val="CodeBlock"/>
+        <w:keepNext/>
+        <w:keepLines/>
+      </w:pPr>
       <w:r>
-        <w:br/>
-      </w:r>
-      <w:r>
-        <w:rPr>
-          <w:rFonts w:ascii="Consolas" w:hAnsi="Consolas"/>
-          <w:color w:val="1C2B39"/>
-          <w:sz w:val="15"/>
-        </w:rPr>
         <w:t>output_dir.mkdir(exist_ok=True)</w:t>
       </w:r>
+    </w:p>
+    <w:p>
+      <w:pPr>
+        <w:pStyle w:val="CodeBlock"/>
+        <w:keepNext/>
+        <w:keepLines/>
+      </w:pPr>
+    </w:p>
+    <w:p>
+      <w:pPr>
+        <w:pStyle w:val="CodeBlock"/>
+        <w:keepNext/>
+        <w:keepLines/>
+      </w:pPr>
       <w:r>
-        <w:br/>
-      </w:r>
-      <w:r>
-        <w:rPr>
-          <w:rFonts w:ascii="Consolas" w:hAnsi="Consolas"/>
-          <w:color w:val="1C2B39"/>
-          <w:sz w:val="15"/>
-        </w:rPr>
-        <w:t xml:space="preserve"> </w:t>
-      </w:r>
-      <w:r>
-        <w:br/>
-      </w:r>
-      <w:r>
-        <w:rPr>
-          <w:rFonts w:ascii="Consolas" w:hAnsi="Consolas"/>
-          <w:color w:val="1C2B39"/>
-          <w:sz w:val="15"/>
-        </w:rPr>
         <w:t>def read_image(filename):</w:t>
       </w:r>
+    </w:p>
+    <w:p>
+      <w:pPr>
+        <w:pStyle w:val="CodeBlock"/>
+        <w:keepNext/>
+        <w:keepLines/>
+      </w:pPr>
       <w:r>
-        <w:br/>
-      </w:r>
-      <w:r>
-        <w:rPr>
-          <w:rFonts w:ascii="Consolas" w:hAnsi="Consolas"/>
-          <w:color w:val="1C2B39"/>
-          <w:sz w:val="15"/>
-        </w:rPr>
         <w:t xml:space="preserve">    image = cv2.imread(str(image_dir / filename))</w:t>
       </w:r>
+    </w:p>
+    <w:p>
+      <w:pPr>
+        <w:pStyle w:val="CodeBlock"/>
+        <w:keepNext/>
+        <w:keepLines/>
+      </w:pPr>
       <w:r>
-        <w:br/>
-      </w:r>
-      <w:r>
-        <w:rPr>
-          <w:rFonts w:ascii="Consolas" w:hAnsi="Consolas"/>
-          <w:color w:val="1C2B39"/>
-          <w:sz w:val="15"/>
-        </w:rPr>
         <w:t xml:space="preserve">    if image is None:</w:t>
       </w:r>
+    </w:p>
+    <w:p>
+      <w:pPr>
+        <w:pStyle w:val="CodeBlock"/>
+        <w:keepNext/>
+        <w:keepLines/>
+      </w:pPr>
       <w:r>
-        <w:br/>
-      </w:r>
-      <w:r>
-        <w:rPr>
-          <w:rFonts w:ascii="Consolas" w:hAnsi="Consolas"/>
-          <w:color w:val="1C2B39"/>
-          <w:sz w:val="15"/>
-        </w:rPr>
         <w:t xml:space="preserve">        raise FileNotFoundError(f"Could not read {filename}")</w:t>
       </w:r>
+    </w:p>
+    <w:p>
+      <w:pPr>
+        <w:pStyle w:val="CodeBlock"/>
+        <w:keepLines/>
+        <w:spacing w:after="200"/>
+      </w:pPr>
       <w:r>
-        <w:br/>
-      </w:r>
-      <w:r>
-        <w:rPr>
-          <w:rFonts w:ascii="Consolas" w:hAnsi="Consolas"/>
-          <w:color w:val="1C2B39"/>
-          <w:sz w:val="15"/>
-        </w:rPr>
         <w:t xml:space="preserve">    return image</w:t>
       </w:r>
     </w:p>
     <w:p>
+      <w:pPr>
+        <w:pStyle w:val="Heading1"/>
+        <w:pageBreakBefore/>
+      </w:pPr>
       <w:r>
-        <w:br w:type="page"/>
+        <w:lastRenderedPageBreak/>
+        <w:t>3. Task 1: Selective Colour Isolation</w:t>
       </w:r>
     </w:p>
     <w:p>
       <w:pPr>
-        <w:pStyle w:val="Heading1"/>
-        <w:spacing w:before="200" w:after="80"/>
+        <w:pStyle w:val="Heading2"/>
       </w:pPr>
       <w:r>
-        <w:rPr>
-          <w:rFonts w:ascii="Aptos Display" w:hAnsi="Aptos Display"/>
-          <w:sz w:val="32"/>
-        </w:rPr>
-        <w:lastRenderedPageBreak/>
-        <w:t>Task 1 Selective Colour Isolation</w:t>
+        <w:t>3.1 Objective</w:t>
       </w:r>
     </w:p>
     <w:p>
-      <w:pPr>
-        <w:pStyle w:val="Heading2"/>
-        <w:spacing w:before="120" w:after="80"/>
-      </w:pPr>
-      <w:r>
-        <w:rPr>
-          <w:rFonts w:ascii="Aptos Display" w:hAnsi="Aptos Display"/>
-          <w:color w:val="3D7E80"/>
-          <w:sz w:val="24"/>
-        </w:rPr>
-        <w:t>Objective</w:t>
-      </w:r>
-    </w:p>
-    <w:p>
-      <w:pPr>
-        <w:spacing w:after="100" w:line="259" w:lineRule="auto"/>
-      </w:pPr>
       <w:r>
         <w:t>Keep red-dominant apple pixels in colour and convert the remaining image to grayscale.</w:t>
       </w:r>
@@ -395,21 +490,12 @@
     <w:p>
       <w:pPr>
         <w:pStyle w:val="Heading2"/>
-        <w:spacing w:before="120" w:after="80"/>
       </w:pPr>
       <w:r>
-        <w:rPr>
-          <w:rFonts w:ascii="Aptos Display" w:hAnsi="Aptos Display"/>
-          <w:color w:val="3D7E80"/>
-          <w:sz w:val="24"/>
-        </w:rPr>
-        <w:t>Method and explanation</w:t>
+        <w:t>3.2 Method and explanation</w:t>
       </w:r>
     </w:p>
     <w:p>
-      <w:pPr>
-        <w:spacing w:after="100" w:line="259" w:lineRule="auto"/>
-      </w:pPr>
       <w:r>
         <w:t>The image is converted to grayscale and split into blue, green, and red channels. A binary mask selects pixels where red is above 100 and exceeds both green and blue by more than 15. Bitwise operations combine the selected original pixels with the inverse-mask grayscale background.</w:t>
       </w:r>
@@ -417,292 +503,246 @@
     <w:p>
       <w:pPr>
         <w:pStyle w:val="Heading2"/>
-        <w:spacing w:before="120" w:after="80"/>
       </w:pPr>
       <w:r>
-        <w:rPr>
-          <w:rFonts w:ascii="Aptos Display" w:hAnsi="Aptos Display"/>
-          <w:color w:val="3D7E80"/>
-          <w:sz w:val="24"/>
-        </w:rPr>
-        <w:t>Code</w:t>
+        <w:t>3.3 Code</w:t>
       </w:r>
     </w:p>
     <w:p>
       <w:pPr>
-        <w:shd w:val="clear" w:color="auto" w:fill="F3F6F8"/>
-        <w:spacing w:after="120" w:line="240" w:lineRule="auto"/>
-        <w:ind w:left="173"/>
+        <w:pStyle w:val="CodeBlock"/>
+        <w:keepNext/>
+        <w:keepLines/>
+        <w:spacing w:before="60"/>
       </w:pPr>
       <w:r>
-        <w:rPr>
-          <w:rFonts w:ascii="Consolas" w:hAnsi="Consolas"/>
-          <w:color w:val="1C2B39"/>
-          <w:sz w:val="15"/>
-        </w:rPr>
         <w:t>img = read_image("apple.png")</w:t>
       </w:r>
+    </w:p>
+    <w:p>
+      <w:pPr>
+        <w:pStyle w:val="CodeBlock"/>
+        <w:keepNext/>
+        <w:keepLines/>
+      </w:pPr>
       <w:r>
-        <w:br/>
-      </w:r>
-      <w:r>
-        <w:rPr>
-          <w:rFonts w:ascii="Consolas" w:hAnsi="Consolas"/>
-          <w:color w:val="1C2B39"/>
-          <w:sz w:val="15"/>
-        </w:rPr>
         <w:t>gray = cv2.cvtColor(img, cv2.COLOR_BGR2GRAY)</w:t>
       </w:r>
+    </w:p>
+    <w:p>
+      <w:pPr>
+        <w:pStyle w:val="CodeBlock"/>
+        <w:keepNext/>
+        <w:keepLines/>
+      </w:pPr>
       <w:r>
-        <w:br/>
-      </w:r>
-      <w:r>
-        <w:rPr>
-          <w:rFonts w:ascii="Consolas" w:hAnsi="Consolas"/>
-          <w:color w:val="1C2B39"/>
-          <w:sz w:val="15"/>
-        </w:rPr>
         <w:t>gray_bgr = cv2.cvtColor(gray, cv2.COLOR_GRAY2BGR)</w:t>
       </w:r>
+    </w:p>
+    <w:p>
+      <w:pPr>
+        <w:pStyle w:val="CodeBlock"/>
+        <w:keepNext/>
+        <w:keepLines/>
+      </w:pPr>
       <w:r>
-        <w:br/>
-      </w:r>
-      <w:r>
-        <w:rPr>
-          <w:rFonts w:ascii="Consolas" w:hAnsi="Consolas"/>
-          <w:color w:val="1C2B39"/>
-          <w:sz w:val="15"/>
-        </w:rPr>
         <w:t>b, g, r = cv2.split(img)</w:t>
       </w:r>
+    </w:p>
+    <w:p>
+      <w:pPr>
+        <w:pStyle w:val="CodeBlock"/>
+        <w:keepNext/>
+        <w:keepLines/>
+      </w:pPr>
+    </w:p>
+    <w:p>
+      <w:pPr>
+        <w:pStyle w:val="CodeBlock"/>
+        <w:keepNext/>
+        <w:keepLines/>
+      </w:pPr>
       <w:r>
-        <w:br/>
-      </w:r>
-      <w:r>
-        <w:rPr>
-          <w:rFonts w:ascii="Consolas" w:hAnsi="Consolas"/>
-          <w:color w:val="1C2B39"/>
-          <w:sz w:val="15"/>
-        </w:rPr>
-        <w:t xml:space="preserve"> </w:t>
-      </w:r>
-      <w:r>
-        <w:br/>
-      </w:r>
-      <w:r>
-        <w:rPr>
-          <w:rFonts w:ascii="Consolas" w:hAnsi="Consolas"/>
-          <w:color w:val="1C2B39"/>
-          <w:sz w:val="15"/>
-        </w:rPr>
         <w:t>mask1 = cv2.threshold(r, 100, 255, cv2.THRESH_BINARY)[1]</w:t>
       </w:r>
+    </w:p>
+    <w:p>
+      <w:pPr>
+        <w:pStyle w:val="CodeBlock"/>
+        <w:keepNext/>
+        <w:keepLines/>
+      </w:pPr>
       <w:r>
-        <w:br/>
-      </w:r>
-      <w:r>
-        <w:rPr>
-          <w:rFonts w:ascii="Consolas" w:hAnsi="Consolas"/>
-          <w:color w:val="1C2B39"/>
-          <w:sz w:val="15"/>
-        </w:rPr>
         <w:t>mask2 = cv2.compare(r.astype(np.int16), g.astype(np.int16) + 15, cv2.CMP_GT)</w:t>
       </w:r>
+    </w:p>
+    <w:p>
+      <w:pPr>
+        <w:pStyle w:val="CodeBlock"/>
+        <w:keepNext/>
+        <w:keepLines/>
+      </w:pPr>
       <w:r>
-        <w:br/>
-      </w:r>
-      <w:r>
-        <w:rPr>
-          <w:rFonts w:ascii="Consolas" w:hAnsi="Consolas"/>
-          <w:color w:val="1C2B39"/>
-          <w:sz w:val="15"/>
-        </w:rPr>
         <w:t>mask3 = cv2.compare(r.astype(np.int16), b.astype(np.int16) + 15, cv2.CMP_GT)</w:t>
       </w:r>
+    </w:p>
+    <w:p>
+      <w:pPr>
+        <w:pStyle w:val="CodeBlock"/>
+        <w:keepNext/>
+        <w:keepLines/>
+      </w:pPr>
       <w:r>
-        <w:br/>
-      </w:r>
-      <w:r>
-        <w:rPr>
-          <w:rFonts w:ascii="Consolas" w:hAnsi="Consolas"/>
-          <w:color w:val="1C2B39"/>
-          <w:sz w:val="15"/>
-        </w:rPr>
         <w:t>mask = cv2.bitwise_and(cv2.bitwise_and(mask1, mask2), mask3)</w:t>
       </w:r>
+    </w:p>
+    <w:p>
+      <w:pPr>
+        <w:pStyle w:val="CodeBlock"/>
+        <w:keepNext/>
+        <w:keepLines/>
+      </w:pPr>
+    </w:p>
+    <w:p>
+      <w:pPr>
+        <w:pStyle w:val="CodeBlock"/>
+        <w:keepNext/>
+        <w:keepLines/>
+      </w:pPr>
       <w:r>
-        <w:br/>
-      </w:r>
-      <w:r>
-        <w:rPr>
-          <w:rFonts w:ascii="Consolas" w:hAnsi="Consolas"/>
-          <w:color w:val="1C2B39"/>
-          <w:sz w:val="15"/>
-        </w:rPr>
-        <w:t xml:space="preserve"> </w:t>
-      </w:r>
-      <w:r>
-        <w:br/>
-      </w:r>
-      <w:r>
-        <w:rPr>
-          <w:rFonts w:ascii="Consolas" w:hAnsi="Consolas"/>
-          <w:color w:val="1C2B39"/>
-          <w:sz w:val="15"/>
-        </w:rPr>
         <w:t>red_apple = cv2.bitwise_and(img, img, mask=mask)</w:t>
       </w:r>
+    </w:p>
+    <w:p>
+      <w:pPr>
+        <w:pStyle w:val="CodeBlock"/>
+        <w:keepNext/>
+        <w:keepLines/>
+      </w:pPr>
       <w:r>
-        <w:br/>
-      </w:r>
-      <w:r>
-        <w:rPr>
-          <w:rFonts w:ascii="Consolas" w:hAnsi="Consolas"/>
-          <w:color w:val="1C2B39"/>
-          <w:sz w:val="15"/>
-        </w:rPr>
         <w:t>gray_background = cv2.bitwise_and(</w:t>
       </w:r>
+    </w:p>
+    <w:p>
+      <w:pPr>
+        <w:pStyle w:val="CodeBlock"/>
+        <w:keepNext/>
+        <w:keepLines/>
+      </w:pPr>
       <w:r>
-        <w:br/>
-      </w:r>
-      <w:r>
-        <w:rPr>
-          <w:rFonts w:ascii="Consolas" w:hAnsi="Consolas"/>
-          <w:color w:val="1C2B39"/>
-          <w:sz w:val="15"/>
-        </w:rPr>
         <w:t xml:space="preserve">    gray_bgr, gray_bgr, mask=cv2.bitwise_not(mask)</w:t>
       </w:r>
+    </w:p>
+    <w:p>
+      <w:pPr>
+        <w:pStyle w:val="CodeBlock"/>
+        <w:keepNext/>
+        <w:keepLines/>
+      </w:pPr>
       <w:r>
-        <w:br/>
-      </w:r>
-      <w:r>
-        <w:rPr>
-          <w:rFonts w:ascii="Consolas" w:hAnsi="Consolas"/>
-          <w:color w:val="1C2B39"/>
-          <w:sz w:val="15"/>
-        </w:rPr>
         <w:t>)</w:t>
       </w:r>
+    </w:p>
+    <w:p>
+      <w:pPr>
+        <w:pStyle w:val="CodeBlock"/>
+        <w:keepNext/>
+        <w:keepLines/>
+      </w:pPr>
       <w:r>
-        <w:br/>
-      </w:r>
-      <w:r>
-        <w:rPr>
-          <w:rFonts w:ascii="Consolas" w:hAnsi="Consolas"/>
-          <w:color w:val="1C2B39"/>
-          <w:sz w:val="15"/>
-        </w:rPr>
         <w:t>result1 = cv2.add(red_apple, gray_background)</w:t>
       </w:r>
+    </w:p>
+    <w:p>
+      <w:pPr>
+        <w:pStyle w:val="CodeBlock"/>
+        <w:keepNext/>
+        <w:keepLines/>
+      </w:pPr>
+    </w:p>
+    <w:p>
+      <w:pPr>
+        <w:pStyle w:val="CodeBlock"/>
+        <w:keepNext/>
+        <w:keepLines/>
+      </w:pPr>
       <w:r>
-        <w:br/>
-      </w:r>
-      <w:r>
-        <w:rPr>
-          <w:rFonts w:ascii="Consolas" w:hAnsi="Consolas"/>
-          <w:color w:val="1C2B39"/>
-          <w:sz w:val="15"/>
-        </w:rPr>
-        <w:t xml:space="preserve"> </w:t>
-      </w:r>
-      <w:r>
-        <w:br/>
-      </w:r>
-      <w:r>
-        <w:rPr>
-          <w:rFonts w:ascii="Consolas" w:hAnsi="Consolas"/>
-          <w:color w:val="1C2B39"/>
-          <w:sz w:val="15"/>
-        </w:rPr>
         <w:t>cv2.imwrite("results/task1_grayscale.png", gray_bgr)</w:t>
       </w:r>
+    </w:p>
+    <w:p>
+      <w:pPr>
+        <w:pStyle w:val="CodeBlock"/>
+        <w:keepNext/>
+        <w:keepLines/>
+      </w:pPr>
       <w:r>
-        <w:br/>
-      </w:r>
-      <w:r>
-        <w:rPr>
-          <w:rFonts w:ascii="Consolas" w:hAnsi="Consolas"/>
-          <w:color w:val="1C2B39"/>
-          <w:sz w:val="15"/>
-        </w:rPr>
         <w:t>cv2.imwrite("results/task1_mask.png", mask)</w:t>
       </w:r>
+    </w:p>
+    <w:p>
+      <w:pPr>
+        <w:pStyle w:val="CodeBlock"/>
+        <w:keepNext/>
+        <w:keepLines/>
+      </w:pPr>
       <w:r>
-        <w:br/>
-      </w:r>
-      <w:r>
-        <w:rPr>
-          <w:rFonts w:ascii="Consolas" w:hAnsi="Consolas"/>
-          <w:color w:val="1C2B39"/>
-          <w:sz w:val="15"/>
-        </w:rPr>
         <w:t>cv2.imwrite("results/task1_result.png", result1)</w:t>
       </w:r>
+    </w:p>
+    <w:p>
+      <w:pPr>
+        <w:pStyle w:val="CodeBlock"/>
+        <w:keepNext/>
+        <w:keepLines/>
+      </w:pPr>
       <w:r>
-        <w:br/>
-      </w:r>
-      <w:r>
-        <w:rPr>
-          <w:rFonts w:ascii="Consolas" w:hAnsi="Consolas"/>
-          <w:color w:val="1C2B39"/>
-          <w:sz w:val="15"/>
-        </w:rPr>
         <w:t>cv2_imshow(gray_bgr)</w:t>
       </w:r>
+    </w:p>
+    <w:p>
+      <w:pPr>
+        <w:pStyle w:val="CodeBlock"/>
+        <w:keepNext/>
+        <w:keepLines/>
+      </w:pPr>
       <w:r>
-        <w:br/>
-      </w:r>
-      <w:r>
-        <w:rPr>
-          <w:rFonts w:ascii="Consolas" w:hAnsi="Consolas"/>
-          <w:color w:val="1C2B39"/>
-          <w:sz w:val="15"/>
-        </w:rPr>
         <w:t>cv2_imshow(mask)</w:t>
       </w:r>
+    </w:p>
+    <w:p>
+      <w:pPr>
+        <w:pStyle w:val="CodeBlock"/>
+        <w:keepNext/>
+        <w:keepLines/>
+      </w:pPr>
       <w:r>
-        <w:br/>
-      </w:r>
-      <w:r>
-        <w:rPr>
-          <w:rFonts w:ascii="Consolas" w:hAnsi="Consolas"/>
-          <w:color w:val="1C2B39"/>
-          <w:sz w:val="15"/>
-        </w:rPr>
         <w:t>cv2_imshow(img)</w:t>
       </w:r>
+    </w:p>
+    <w:p>
+      <w:pPr>
+        <w:pStyle w:val="CodeBlock"/>
+        <w:keepLines/>
+        <w:spacing w:after="200"/>
+      </w:pPr>
       <w:r>
-        <w:br/>
-      </w:r>
-      <w:r>
-        <w:rPr>
-          <w:rFonts w:ascii="Consolas" w:hAnsi="Consolas"/>
-          <w:color w:val="1C2B39"/>
-          <w:sz w:val="15"/>
-        </w:rPr>
         <w:t>cv2_imshow(result1)</w:t>
       </w:r>
     </w:p>
     <w:p>
       <w:pPr>
         <w:pStyle w:val="Heading2"/>
-        <w:spacing w:before="120" w:after="80"/>
       </w:pPr>
       <w:r>
-        <w:rPr>
-          <w:rFonts w:ascii="Aptos Display" w:hAnsi="Aptos Display"/>
-          <w:color w:val="3D7E80"/>
-          <w:sz w:val="24"/>
-        </w:rPr>
         <w:lastRenderedPageBreak/>
-        <w:t>Output</w:t>
+        <w:t>3.4 Output</w:t>
       </w:r>
     </w:p>
     <w:p>
       <w:pPr>
         <w:keepNext/>
+        <w:spacing w:before="120" w:after="0"/>
         <w:jc w:val="center"/>
       </w:pPr>
       <w:r>
@@ -711,7 +751,7 @@
         </w:rPr>
         <w:drawing>
           <wp:inline distT="0" distB="0" distL="0" distR="0" wp14:anchorId="3B6A6854" wp14:editId="7C3133C8">
-            <wp:extent cx="6126480" cy="4196697"/>
+            <wp:extent cx="5943600" cy="4071422"/>
             <wp:effectExtent l="0" t="0" r="0" b="0"/>
             <wp:docPr id="1" name="Picture 1"/>
             <wp:cNvGraphicFramePr>
@@ -725,7 +765,7 @@
                     <pic:cNvPicPr/>
                   </pic:nvPicPr>
                   <pic:blipFill>
-                    <a:blip r:embed="rId8"/>
+                    <a:blip r:embed="rId9"/>
                     <a:stretch>
                       <a:fillRect/>
                     </a:stretch>
@@ -733,7 +773,7 @@
                   <pic:spPr>
                     <a:xfrm>
                       <a:off x="0" y="0"/>
-                      <a:ext cx="6126480" cy="4196697"/>
+                      <a:ext cx="5943600" cy="4071422"/>
                     </a:xfrm>
                     <a:prstGeom prst="rect">
                       <a:avLst/>
@@ -748,54 +788,41 @@
     </w:p>
     <w:p>
       <w:pPr>
-        <w:spacing w:after="80"/>
-        <w:jc w:val="center"/>
+        <w:pStyle w:val="Caption"/>
       </w:pPr>
       <w:r>
         <w:rPr>
-          <w:color w:val="536273"/>
-          <w:sz w:val="17"/>
+          <w:b/>
+          <w:bCs/>
+          <w:i w:val="0"/>
+          <w:iCs w:val="0"/>
+          <w:color w:val="1F3A5F"/>
         </w:rPr>
-        <w:t>Figure 1. Grayscale image, red-dominance mask, original image, and selective-colour composite.</w:t>
+        <w:t xml:space="preserve">Figure 1. </w:t>
+      </w:r>
+      <w:r>
+        <w:t>Grayscale image, red-dominance mask, original image, and selective-colour composite.</w:t>
       </w:r>
     </w:p>
     <w:p>
+      <w:pPr>
+        <w:pStyle w:val="Heading1"/>
+        <w:pageBreakBefore/>
+      </w:pPr>
       <w:r>
-        <w:br w:type="page"/>
+        <w:lastRenderedPageBreak/>
+        <w:t>4. Task 2: Creating a Ghostly Overlay</w:t>
       </w:r>
     </w:p>
     <w:p>
       <w:pPr>
-        <w:pStyle w:val="Heading1"/>
-        <w:spacing w:before="200" w:after="80"/>
+        <w:pStyle w:val="Heading2"/>
       </w:pPr>
       <w:r>
-        <w:rPr>
-          <w:rFonts w:ascii="Aptos Display" w:hAnsi="Aptos Display"/>
-          <w:sz w:val="32"/>
-        </w:rPr>
-        <w:lastRenderedPageBreak/>
-        <w:t>Task 2 Creating a Ghostly Overlay</w:t>
+        <w:t>4.1 Objective</w:t>
       </w:r>
     </w:p>
     <w:p>
-      <w:pPr>
-        <w:pStyle w:val="Heading2"/>
-        <w:spacing w:before="120" w:after="80"/>
-      </w:pPr>
-      <w:r>
-        <w:rPr>
-          <w:rFonts w:ascii="Aptos Display" w:hAnsi="Aptos Display"/>
-          <w:color w:val="3D7E80"/>
-          <w:sz w:val="24"/>
-        </w:rPr>
-        <w:t>Objective</w:t>
-      </w:r>
-    </w:p>
-    <w:p>
-      <w:pPr>
-        <w:spacing w:after="100" w:line="259" w:lineRule="auto"/>
-      </w:pPr>
       <w:r>
         <w:t>Blend the cameraman and zebra images into a translucent composite.</w:t>
       </w:r>
@@ -803,170 +830,140 @@
     <w:p>
       <w:pPr>
         <w:pStyle w:val="Heading2"/>
-        <w:spacing w:before="120" w:after="80"/>
       </w:pPr>
       <w:r>
-        <w:rPr>
-          <w:rFonts w:ascii="Aptos Display" w:hAnsi="Aptos Display"/>
-          <w:color w:val="3D7E80"/>
-          <w:sz w:val="24"/>
-        </w:rPr>
-        <w:t>Method and explanation</w:t>
+        <w:t>4.2 Method and explanation</w:t>
       </w:r>
     </w:p>
     <w:p>
-      <w:pPr>
-        <w:spacing w:after="100" w:line="259" w:lineRule="auto"/>
-      </w:pPr>
       <w:r>
-        <w:t>The zebra image is resized to match the cameraman dimensions. cv2.addWeighted() combines both images with equal 0.5 weights and zero brightness offset, so each source contributes equally.</w:t>
+        <w:t xml:space="preserve">The zebra image is resized to match the cameraman dimensions. </w:t>
+      </w:r>
+      <w:r>
+        <w:rPr>
+          <w:rStyle w:val="InlineCode"/>
+        </w:rPr>
+        <w:t>cv2.addWeighted()</w:t>
+      </w:r>
+      <w:r>
+        <w:t xml:space="preserve"> combines both images with equal 0.5 weights and zero brightness offset, so each source contributes equally.</w:t>
       </w:r>
     </w:p>
     <w:p>
       <w:pPr>
         <w:pStyle w:val="Heading2"/>
-        <w:spacing w:before="120" w:after="80"/>
       </w:pPr>
       <w:r>
-        <w:rPr>
-          <w:rFonts w:ascii="Aptos Display" w:hAnsi="Aptos Display"/>
-          <w:color w:val="3D7E80"/>
-          <w:sz w:val="24"/>
-        </w:rPr>
-        <w:t>Code</w:t>
+        <w:t>4.3 Code</w:t>
       </w:r>
     </w:p>
     <w:p>
       <w:pPr>
-        <w:shd w:val="clear" w:color="auto" w:fill="F3F6F8"/>
-        <w:spacing w:after="120" w:line="240" w:lineRule="auto"/>
-        <w:ind w:left="173"/>
+        <w:pStyle w:val="CodeBlock"/>
+        <w:keepNext/>
+        <w:keepLines/>
+        <w:spacing w:before="60"/>
       </w:pPr>
       <w:r>
-        <w:rPr>
-          <w:rFonts w:ascii="Consolas" w:hAnsi="Consolas"/>
-          <w:color w:val="1C2B39"/>
-          <w:sz w:val="15"/>
-        </w:rPr>
         <w:t>img1 = read_image("cameraman.jpg")</w:t>
       </w:r>
+    </w:p>
+    <w:p>
+      <w:pPr>
+        <w:pStyle w:val="CodeBlock"/>
+        <w:keepNext/>
+        <w:keepLines/>
+      </w:pPr>
       <w:r>
-        <w:br/>
-      </w:r>
-      <w:r>
-        <w:rPr>
-          <w:rFonts w:ascii="Consolas" w:hAnsi="Consolas"/>
-          <w:color w:val="1C2B39"/>
-          <w:sz w:val="15"/>
-        </w:rPr>
         <w:t>img2 = read_image("zebra.png")</w:t>
       </w:r>
+    </w:p>
+    <w:p>
+      <w:pPr>
+        <w:pStyle w:val="CodeBlock"/>
+        <w:keepNext/>
+        <w:keepLines/>
+      </w:pPr>
       <w:r>
-        <w:br/>
-      </w:r>
-      <w:r>
-        <w:rPr>
-          <w:rFonts w:ascii="Consolas" w:hAnsi="Consolas"/>
-          <w:color w:val="1C2B39"/>
-          <w:sz w:val="15"/>
-        </w:rPr>
         <w:t>img2 = cv2.resize(img2, (img1.shape[1], img1.shape[0]))</w:t>
       </w:r>
+    </w:p>
+    <w:p>
+      <w:pPr>
+        <w:pStyle w:val="CodeBlock"/>
+        <w:keepNext/>
+        <w:keepLines/>
+      </w:pPr>
+    </w:p>
+    <w:p>
+      <w:pPr>
+        <w:pStyle w:val="CodeBlock"/>
+        <w:keepNext/>
+        <w:keepLines/>
+      </w:pPr>
       <w:r>
-        <w:br/>
-      </w:r>
-      <w:r>
-        <w:rPr>
-          <w:rFonts w:ascii="Consolas" w:hAnsi="Consolas"/>
-          <w:color w:val="1C2B39"/>
-          <w:sz w:val="15"/>
-        </w:rPr>
-        <w:t xml:space="preserve"> </w:t>
-      </w:r>
-      <w:r>
-        <w:br/>
-      </w:r>
-      <w:r>
-        <w:rPr>
-          <w:rFonts w:ascii="Consolas" w:hAnsi="Consolas"/>
-          <w:color w:val="1C2B39"/>
-          <w:sz w:val="15"/>
-        </w:rPr>
         <w:t>result2 = cv2.addWeighted(img1, 0.5, img2, 0.5, 0)</w:t>
       </w:r>
+    </w:p>
+    <w:p>
+      <w:pPr>
+        <w:pStyle w:val="CodeBlock"/>
+        <w:keepNext/>
+        <w:keepLines/>
+      </w:pPr>
       <w:r>
-        <w:br/>
-      </w:r>
-      <w:r>
-        <w:rPr>
-          <w:rFonts w:ascii="Consolas" w:hAnsi="Consolas"/>
-          <w:color w:val="1C2B39"/>
-          <w:sz w:val="15"/>
-        </w:rPr>
         <w:t>cv2.imwrite("results/task2_ghost.png", result2)</w:t>
       </w:r>
+    </w:p>
+    <w:p>
+      <w:pPr>
+        <w:pStyle w:val="CodeBlock"/>
+        <w:keepNext/>
+        <w:keepLines/>
+      </w:pPr>
+    </w:p>
+    <w:p>
+      <w:pPr>
+        <w:pStyle w:val="CodeBlock"/>
+        <w:keepNext/>
+        <w:keepLines/>
+      </w:pPr>
       <w:r>
-        <w:br/>
-      </w:r>
-      <w:r>
-        <w:rPr>
-          <w:rFonts w:ascii="Consolas" w:hAnsi="Consolas"/>
-          <w:color w:val="1C2B39"/>
-          <w:sz w:val="15"/>
-        </w:rPr>
-        <w:t xml:space="preserve"> </w:t>
-      </w:r>
-      <w:r>
-        <w:br/>
-      </w:r>
-      <w:r>
-        <w:rPr>
-          <w:rFonts w:ascii="Consolas" w:hAnsi="Consolas"/>
-          <w:color w:val="1C2B39"/>
-          <w:sz w:val="15"/>
-        </w:rPr>
         <w:t>cv2_imshow(img1)</w:t>
       </w:r>
+    </w:p>
+    <w:p>
+      <w:pPr>
+        <w:pStyle w:val="CodeBlock"/>
+        <w:keepNext/>
+        <w:keepLines/>
+      </w:pPr>
       <w:r>
-        <w:br/>
-      </w:r>
-      <w:r>
-        <w:rPr>
-          <w:rFonts w:ascii="Consolas" w:hAnsi="Consolas"/>
-          <w:color w:val="1C2B39"/>
-          <w:sz w:val="15"/>
-        </w:rPr>
         <w:t>cv2_imshow(img2)</w:t>
       </w:r>
+    </w:p>
+    <w:p>
+      <w:pPr>
+        <w:pStyle w:val="CodeBlock"/>
+        <w:keepLines/>
+        <w:spacing w:after="200"/>
+      </w:pPr>
       <w:r>
-        <w:br/>
-      </w:r>
-      <w:r>
-        <w:rPr>
-          <w:rFonts w:ascii="Consolas" w:hAnsi="Consolas"/>
-          <w:color w:val="1C2B39"/>
-          <w:sz w:val="15"/>
-        </w:rPr>
         <w:t>cv2_imshow(result2)</w:t>
       </w:r>
     </w:p>
     <w:p>
       <w:pPr>
         <w:pStyle w:val="Heading2"/>
-        <w:spacing w:before="120" w:after="80"/>
       </w:pPr>
       <w:r>
-        <w:rPr>
-          <w:rFonts w:ascii="Aptos Display" w:hAnsi="Aptos Display"/>
-          <w:color w:val="3D7E80"/>
-          <w:sz w:val="24"/>
-        </w:rPr>
-        <w:t>Output</w:t>
+        <w:t>4.4 Output</w:t>
       </w:r>
     </w:p>
     <w:p>
       <w:pPr>
         <w:keepNext/>
+        <w:spacing w:before="120" w:after="0"/>
         <w:jc w:val="center"/>
       </w:pPr>
       <w:r>
@@ -975,7 +972,7 @@
         </w:rPr>
         <w:drawing>
           <wp:inline distT="0" distB="0" distL="0" distR="0" wp14:anchorId="069C74A0" wp14:editId="3B32C011">
-            <wp:extent cx="6126480" cy="1903708"/>
+            <wp:extent cx="5943600" cy="1846881"/>
             <wp:effectExtent l="0" t="0" r="0" b="0"/>
             <wp:docPr id="2" name="Picture 2"/>
             <wp:cNvGraphicFramePr>
@@ -989,7 +986,7 @@
                     <pic:cNvPicPr/>
                   </pic:nvPicPr>
                   <pic:blipFill>
-                    <a:blip r:embed="rId9"/>
+                    <a:blip r:embed="rId10"/>
                     <a:stretch>
                       <a:fillRect/>
                     </a:stretch>
@@ -997,7 +994,7 @@
                   <pic:spPr>
                     <a:xfrm>
                       <a:off x="0" y="0"/>
-                      <a:ext cx="6126480" cy="1903708"/>
+                      <a:ext cx="5943600" cy="1846881"/>
                     </a:xfrm>
                     <a:prstGeom prst="rect">
                       <a:avLst/>
@@ -1012,54 +1009,41 @@
     </w:p>
     <w:p>
       <w:pPr>
-        <w:spacing w:after="80"/>
-        <w:jc w:val="center"/>
+        <w:pStyle w:val="Caption"/>
       </w:pPr>
       <w:r>
         <w:rPr>
-          <w:color w:val="536273"/>
-          <w:sz w:val="17"/>
+          <w:b/>
+          <w:bCs/>
+          <w:i w:val="0"/>
+          <w:iCs w:val="0"/>
+          <w:color w:val="1F3A5F"/>
         </w:rPr>
-        <w:t>Figure 2. Source images and their equal-weight overlay.</w:t>
+        <w:t xml:space="preserve">Figure 2. </w:t>
+      </w:r>
+      <w:r>
+        <w:t>Source images and their equal-weight overlay.</w:t>
       </w:r>
     </w:p>
     <w:p>
+      <w:pPr>
+        <w:pStyle w:val="Heading1"/>
+        <w:pageBreakBefore/>
+      </w:pPr>
       <w:r>
-        <w:br w:type="page"/>
+        <w:lastRenderedPageBreak/>
+        <w:t>5. Task 3: Artistic Vignette Filtering</w:t>
       </w:r>
     </w:p>
     <w:p>
       <w:pPr>
-        <w:pStyle w:val="Heading1"/>
-        <w:spacing w:before="200" w:after="80"/>
+        <w:pStyle w:val="Heading2"/>
       </w:pPr>
       <w:r>
-        <w:rPr>
-          <w:rFonts w:ascii="Aptos Display" w:hAnsi="Aptos Display"/>
-          <w:sz w:val="32"/>
-        </w:rPr>
-        <w:lastRenderedPageBreak/>
-        <w:t>Task 3 Artistic Vignette Filtering</w:t>
+        <w:t>5.1 Objective</w:t>
       </w:r>
     </w:p>
     <w:p>
-      <w:pPr>
-        <w:pStyle w:val="Heading2"/>
-        <w:spacing w:before="120" w:after="80"/>
-      </w:pPr>
-      <w:r>
-        <w:rPr>
-          <w:rFonts w:ascii="Aptos Display" w:hAnsi="Aptos Display"/>
-          <w:color w:val="3D7E80"/>
-          <w:sz w:val="24"/>
-        </w:rPr>
-        <w:t>Objective</w:t>
-      </w:r>
-    </w:p>
-    <w:p>
-      <w:pPr>
-        <w:spacing w:after="100" w:line="259" w:lineRule="auto"/>
-      </w:pPr>
       <w:r>
         <w:t>Darken the outer edges gradually while preserving a brighter central region.</w:t>
       </w:r>
@@ -1067,21 +1051,12 @@
     <w:p>
       <w:pPr>
         <w:pStyle w:val="Heading2"/>
-        <w:spacing w:before="120" w:after="80"/>
       </w:pPr>
       <w:r>
-        <w:rPr>
-          <w:rFonts w:ascii="Aptos Display" w:hAnsi="Aptos Display"/>
-          <w:color w:val="3D7E80"/>
-          <w:sz w:val="24"/>
-        </w:rPr>
-        <w:t>Method and explanation</w:t>
+        <w:t>5.2 Method and explanation</w:t>
       </w:r>
     </w:p>
     <w:p>
-      <w:pPr>
-        <w:spacing w:after="100" w:line="259" w:lineRule="auto"/>
-      </w:pPr>
       <w:r>
         <w:t>A black mask is created and a filled white circle is drawn at the image centre. Gaussian blur softens the circular boundary. The mask is normalized to 0–1 and multiplied into the image, reducing brightness toward the edges.</w:t>
       </w:r>
@@ -1089,203 +1064,171 @@
     <w:p>
       <w:pPr>
         <w:pStyle w:val="Heading2"/>
-        <w:spacing w:before="120" w:after="80"/>
       </w:pPr>
       <w:r>
-        <w:rPr>
-          <w:rFonts w:ascii="Aptos Display" w:hAnsi="Aptos Display"/>
-          <w:color w:val="3D7E80"/>
-          <w:sz w:val="24"/>
-        </w:rPr>
-        <w:t>Code</w:t>
+        <w:t>5.3 Code</w:t>
       </w:r>
     </w:p>
     <w:p>
       <w:pPr>
-        <w:shd w:val="clear" w:color="auto" w:fill="F3F6F8"/>
-        <w:spacing w:after="120" w:line="240" w:lineRule="auto"/>
-        <w:ind w:left="173"/>
+        <w:pStyle w:val="CodeBlock"/>
+        <w:keepNext/>
+        <w:keepLines/>
+        <w:spacing w:before="60"/>
       </w:pPr>
       <w:r>
-        <w:rPr>
-          <w:rFonts w:ascii="Consolas" w:hAnsi="Consolas"/>
-          <w:color w:val="1C2B39"/>
-          <w:sz w:val="15"/>
-        </w:rPr>
         <w:t>img = read_image("marsrover.png")</w:t>
       </w:r>
+    </w:p>
+    <w:p>
+      <w:pPr>
+        <w:pStyle w:val="CodeBlock"/>
+        <w:keepNext/>
+        <w:keepLines/>
+      </w:pPr>
       <w:r>
-        <w:br/>
-      </w:r>
-      <w:r>
-        <w:rPr>
-          <w:rFonts w:ascii="Consolas" w:hAnsi="Consolas"/>
-          <w:color w:val="1C2B39"/>
-          <w:sz w:val="15"/>
-        </w:rPr>
         <w:t>height, width = img.shape[:2]</w:t>
       </w:r>
+    </w:p>
+    <w:p>
+      <w:pPr>
+        <w:pStyle w:val="CodeBlock"/>
+        <w:keepNext/>
+        <w:keepLines/>
+      </w:pPr>
       <w:r>
-        <w:br/>
-      </w:r>
-      <w:r>
-        <w:rPr>
-          <w:rFonts w:ascii="Consolas" w:hAnsi="Consolas"/>
-          <w:color w:val="1C2B39"/>
-          <w:sz w:val="15"/>
-        </w:rPr>
         <w:t>mask = np.zeros((height, width), dtype=np.uint8)</w:t>
       </w:r>
+    </w:p>
+    <w:p>
+      <w:pPr>
+        <w:pStyle w:val="CodeBlock"/>
+        <w:keepNext/>
+        <w:keepLines/>
+      </w:pPr>
       <w:r>
-        <w:br/>
-      </w:r>
-      <w:r>
-        <w:rPr>
-          <w:rFonts w:ascii="Consolas" w:hAnsi="Consolas"/>
-          <w:color w:val="1C2B39"/>
-          <w:sz w:val="15"/>
-        </w:rPr>
         <w:t>center = (width // 2, height // 2)</w:t>
       </w:r>
+    </w:p>
+    <w:p>
+      <w:pPr>
+        <w:pStyle w:val="CodeBlock"/>
+        <w:keepNext/>
+        <w:keepLines/>
+      </w:pPr>
       <w:r>
-        <w:br/>
-      </w:r>
-      <w:r>
-        <w:rPr>
-          <w:rFonts w:ascii="Consolas" w:hAnsi="Consolas"/>
-          <w:color w:val="1C2B39"/>
-          <w:sz w:val="15"/>
-        </w:rPr>
         <w:t>radius = min(height, width) // 2</w:t>
       </w:r>
+    </w:p>
+    <w:p>
+      <w:pPr>
+        <w:pStyle w:val="CodeBlock"/>
+        <w:keepNext/>
+        <w:keepLines/>
+      </w:pPr>
       <w:r>
-        <w:br/>
-      </w:r>
-      <w:r>
-        <w:rPr>
-          <w:rFonts w:ascii="Consolas" w:hAnsi="Consolas"/>
-          <w:color w:val="1C2B39"/>
-          <w:sz w:val="15"/>
-        </w:rPr>
         <w:t>cv2.circle(mask, center, radius, 255, -1)</w:t>
       </w:r>
+    </w:p>
+    <w:p>
+      <w:pPr>
+        <w:pStyle w:val="CodeBlock"/>
+        <w:keepNext/>
+        <w:keepLines/>
+      </w:pPr>
       <w:r>
-        <w:br/>
-      </w:r>
-      <w:r>
-        <w:rPr>
-          <w:rFonts w:ascii="Consolas" w:hAnsi="Consolas"/>
-          <w:color w:val="1C2B39"/>
-          <w:sz w:val="15"/>
-        </w:rPr>
         <w:t>mask = cv2.GaussianBlur(mask, (101, 101), 50)</w:t>
       </w:r>
+    </w:p>
+    <w:p>
+      <w:pPr>
+        <w:pStyle w:val="CodeBlock"/>
+        <w:keepNext/>
+        <w:keepLines/>
+      </w:pPr>
+    </w:p>
+    <w:p>
+      <w:pPr>
+        <w:pStyle w:val="CodeBlock"/>
+        <w:keepNext/>
+        <w:keepLines/>
+      </w:pPr>
       <w:r>
-        <w:br/>
-      </w:r>
-      <w:r>
-        <w:rPr>
-          <w:rFonts w:ascii="Consolas" w:hAnsi="Consolas"/>
-          <w:color w:val="1C2B39"/>
-          <w:sz w:val="15"/>
-        </w:rPr>
-        <w:t xml:space="preserve"> </w:t>
-      </w:r>
-      <w:r>
-        <w:br/>
-      </w:r>
-      <w:r>
-        <w:rPr>
-          <w:rFonts w:ascii="Consolas" w:hAnsi="Consolas"/>
-          <w:color w:val="1C2B39"/>
-          <w:sz w:val="15"/>
-        </w:rPr>
         <w:t>mask_float = mask.astype(np.float32) / 255.0</w:t>
       </w:r>
+    </w:p>
+    <w:p>
+      <w:pPr>
+        <w:pStyle w:val="CodeBlock"/>
+        <w:keepNext/>
+        <w:keepLines/>
+      </w:pPr>
       <w:r>
-        <w:br/>
-      </w:r>
-      <w:r>
-        <w:rPr>
-          <w:rFonts w:ascii="Consolas" w:hAnsi="Consolas"/>
-          <w:color w:val="1C2B39"/>
-          <w:sz w:val="15"/>
-        </w:rPr>
         <w:t>result3 = (img.astype(np.float32) * mask_float[:, :, None])</w:t>
       </w:r>
+    </w:p>
+    <w:p>
+      <w:pPr>
+        <w:pStyle w:val="CodeBlock"/>
+        <w:keepNext/>
+        <w:keepLines/>
+      </w:pPr>
       <w:r>
-        <w:br/>
-      </w:r>
-      <w:r>
-        <w:rPr>
-          <w:rFonts w:ascii="Consolas" w:hAnsi="Consolas"/>
-          <w:color w:val="1C2B39"/>
-          <w:sz w:val="15"/>
-        </w:rPr>
         <w:t>result3 = result3.clip(0, 255).astype(np.uint8)</w:t>
       </w:r>
+    </w:p>
+    <w:p>
+      <w:pPr>
+        <w:pStyle w:val="CodeBlock"/>
+        <w:keepNext/>
+        <w:keepLines/>
+      </w:pPr>
       <w:r>
-        <w:br/>
-      </w:r>
-      <w:r>
-        <w:rPr>
-          <w:rFonts w:ascii="Consolas" w:hAnsi="Consolas"/>
-          <w:color w:val="1C2B39"/>
-          <w:sz w:val="15"/>
-        </w:rPr>
         <w:t>cv2.imwrite("results/task3_mask.png", mask)</w:t>
       </w:r>
+    </w:p>
+    <w:p>
+      <w:pPr>
+        <w:pStyle w:val="CodeBlock"/>
+        <w:keepNext/>
+        <w:keepLines/>
+      </w:pPr>
       <w:r>
-        <w:br/>
-      </w:r>
-      <w:r>
-        <w:rPr>
-          <w:rFonts w:ascii="Consolas" w:hAnsi="Consolas"/>
-          <w:color w:val="1C2B39"/>
-          <w:sz w:val="15"/>
-        </w:rPr>
         <w:t>cv2.imwrite("results/task3_vignette.png", result3)</w:t>
       </w:r>
+    </w:p>
+    <w:p>
+      <w:pPr>
+        <w:pStyle w:val="CodeBlock"/>
+        <w:keepNext/>
+        <w:keepLines/>
+      </w:pPr>
       <w:r>
-        <w:br/>
-      </w:r>
-      <w:r>
-        <w:rPr>
-          <w:rFonts w:ascii="Consolas" w:hAnsi="Consolas"/>
-          <w:color w:val="1C2B39"/>
-          <w:sz w:val="15"/>
-        </w:rPr>
         <w:t>cv2_imshow(mask)</w:t>
       </w:r>
+    </w:p>
+    <w:p>
+      <w:pPr>
+        <w:pStyle w:val="CodeBlock"/>
+        <w:keepLines/>
+        <w:spacing w:after="200"/>
+      </w:pPr>
       <w:r>
-        <w:br/>
-      </w:r>
-      <w:r>
-        <w:rPr>
-          <w:rFonts w:ascii="Consolas" w:hAnsi="Consolas"/>
-          <w:color w:val="1C2B39"/>
-          <w:sz w:val="15"/>
-        </w:rPr>
         <w:t>cv2_imshow(result3)</w:t>
       </w:r>
     </w:p>
     <w:p>
       <w:pPr>
         <w:pStyle w:val="Heading2"/>
-        <w:spacing w:before="120" w:after="80"/>
       </w:pPr>
       <w:r>
-        <w:rPr>
-          <w:rFonts w:ascii="Aptos Display" w:hAnsi="Aptos Display"/>
-          <w:color w:val="3D7E80"/>
-          <w:sz w:val="24"/>
-        </w:rPr>
-        <w:t>Output</w:t>
+        <w:t>5.4 Output</w:t>
       </w:r>
     </w:p>
     <w:p>
       <w:pPr>
         <w:keepNext/>
+        <w:spacing w:before="120" w:after="0"/>
         <w:jc w:val="center"/>
       </w:pPr>
       <w:r>
@@ -1294,7 +1237,7 @@
         </w:rPr>
         <w:drawing>
           <wp:inline distT="0" distB="0" distL="0" distR="0" wp14:anchorId="24FF30E2" wp14:editId="6D03065F">
-            <wp:extent cx="6126480" cy="2150662"/>
+            <wp:extent cx="5943600" cy="2086463"/>
             <wp:effectExtent l="0" t="0" r="0" b="0"/>
             <wp:docPr id="3" name="Picture 3"/>
             <wp:cNvGraphicFramePr>
@@ -1308,7 +1251,7 @@
                     <pic:cNvPicPr/>
                   </pic:nvPicPr>
                   <pic:blipFill>
-                    <a:blip r:embed="rId10"/>
+                    <a:blip r:embed="rId11"/>
                     <a:stretch>
                       <a:fillRect/>
                     </a:stretch>
@@ -1316,7 +1259,7 @@
                   <pic:spPr>
                     <a:xfrm>
                       <a:off x="0" y="0"/>
-                      <a:ext cx="6126480" cy="2150662"/>
+                      <a:ext cx="5943600" cy="2086463"/>
                     </a:xfrm>
                     <a:prstGeom prst="rect">
                       <a:avLst/>
@@ -1331,54 +1274,41 @@
     </w:p>
     <w:p>
       <w:pPr>
-        <w:spacing w:after="80"/>
-        <w:jc w:val="center"/>
+        <w:pStyle w:val="Caption"/>
       </w:pPr>
       <w:r>
         <w:rPr>
-          <w:color w:val="536273"/>
-          <w:sz w:val="17"/>
+          <w:b/>
+          <w:bCs/>
+          <w:i w:val="0"/>
+          <w:iCs w:val="0"/>
+          <w:color w:val="1F3A5F"/>
         </w:rPr>
-        <w:t>Figure 3. Soft vignette mask and Mars rover image after application.</w:t>
+        <w:t xml:space="preserve">Figure 3. </w:t>
+      </w:r>
+      <w:r>
+        <w:t>Soft vignette mask and Mars rover image after application.</w:t>
       </w:r>
     </w:p>
     <w:p>
+      <w:pPr>
+        <w:pStyle w:val="Heading1"/>
+        <w:pageBreakBefore/>
+      </w:pPr>
       <w:r>
-        <w:br w:type="page"/>
+        <w:lastRenderedPageBreak/>
+        <w:t>6. Task 4: Channel Swapping</w:t>
       </w:r>
     </w:p>
     <w:p>
       <w:pPr>
-        <w:pStyle w:val="Heading1"/>
-        <w:spacing w:before="200" w:after="80"/>
+        <w:pStyle w:val="Heading2"/>
       </w:pPr>
       <w:r>
-        <w:rPr>
-          <w:rFonts w:ascii="Aptos Display" w:hAnsi="Aptos Display"/>
-          <w:sz w:val="32"/>
-        </w:rPr>
-        <w:lastRenderedPageBreak/>
-        <w:t>Task 4 Channel Swapping</w:t>
+        <w:t>6.1 Objective</w:t>
       </w:r>
     </w:p>
     <w:p>
-      <w:pPr>
-        <w:pStyle w:val="Heading2"/>
-        <w:spacing w:before="120" w:after="80"/>
-      </w:pPr>
-      <w:r>
-        <w:rPr>
-          <w:rFonts w:ascii="Aptos Display" w:hAnsi="Aptos Display"/>
-          <w:color w:val="3D7E80"/>
-          <w:sz w:val="24"/>
-        </w:rPr>
-        <w:t>Objective</w:t>
-      </w:r>
-    </w:p>
-    <w:p>
-      <w:pPr>
-        <w:spacing w:after="100" w:line="259" w:lineRule="auto"/>
-      </w:pPr>
       <w:r>
         <w:t>Produce a surreal palette by merging the zebra image channels in a different order.</w:t>
       </w:r>
@@ -1386,137 +1316,122 @@
     <w:p>
       <w:pPr>
         <w:pStyle w:val="Heading2"/>
-        <w:spacing w:before="120" w:after="80"/>
       </w:pPr>
       <w:r>
-        <w:rPr>
-          <w:rFonts w:ascii="Aptos Display" w:hAnsi="Aptos Display"/>
-          <w:color w:val="3D7E80"/>
-          <w:sz w:val="24"/>
-        </w:rPr>
-        <w:t>Method and explanation</w:t>
+        <w:t>6.2 Method and explanation</w:t>
       </w:r>
     </w:p>
     <w:p>
-      <w:pPr>
-        <w:spacing w:after="100" w:line="259" w:lineRule="auto"/>
-      </w:pPr>
       <w:r>
-        <w:t>OpenCV stores colour images in BGR order. cv2.split() separates the channels and cv2.merge() recombines them as red, blue, green. This changes the represented colours while leaving pixel locations unchanged.</w:t>
+        <w:t xml:space="preserve">OpenCV stores colour images in BGR order. </w:t>
+      </w:r>
+      <w:r>
+        <w:rPr>
+          <w:rStyle w:val="InlineCode"/>
+        </w:rPr>
+        <w:t>cv2.split()</w:t>
+      </w:r>
+      <w:r>
+        <w:t xml:space="preserve"> separates the channels and </w:t>
+      </w:r>
+      <w:r>
+        <w:rPr>
+          <w:rStyle w:val="InlineCode"/>
+        </w:rPr>
+        <w:t>cv2.merge()</w:t>
+      </w:r>
+      <w:r>
+        <w:t xml:space="preserve"> recombines them as red, blue, green. This changes the represented colours while leaving pixel locations unchanged.</w:t>
       </w:r>
     </w:p>
     <w:p>
       <w:pPr>
         <w:pStyle w:val="Heading2"/>
-        <w:spacing w:before="120" w:after="80"/>
       </w:pPr>
       <w:r>
-        <w:rPr>
-          <w:rFonts w:ascii="Aptos Display" w:hAnsi="Aptos Display"/>
-          <w:color w:val="3D7E80"/>
-          <w:sz w:val="24"/>
-        </w:rPr>
-        <w:t>Code</w:t>
+        <w:t>6.3 Code</w:t>
       </w:r>
     </w:p>
     <w:p>
       <w:pPr>
-        <w:shd w:val="clear" w:color="auto" w:fill="F3F6F8"/>
-        <w:spacing w:after="120" w:line="240" w:lineRule="auto"/>
-        <w:ind w:left="173"/>
+        <w:pStyle w:val="CodeBlock"/>
+        <w:keepNext/>
+        <w:keepLines/>
+        <w:spacing w:before="60"/>
       </w:pPr>
       <w:r>
-        <w:rPr>
-          <w:rFonts w:ascii="Consolas" w:hAnsi="Consolas"/>
-          <w:color w:val="1C2B39"/>
-          <w:sz w:val="15"/>
-        </w:rPr>
         <w:t>img = read_image("zebra.png")</w:t>
       </w:r>
+    </w:p>
+    <w:p>
+      <w:pPr>
+        <w:pStyle w:val="CodeBlock"/>
+        <w:keepNext/>
+        <w:keepLines/>
+      </w:pPr>
       <w:r>
-        <w:br/>
-      </w:r>
-      <w:r>
-        <w:rPr>
-          <w:rFonts w:ascii="Consolas" w:hAnsi="Consolas"/>
-          <w:color w:val="1C2B39"/>
-          <w:sz w:val="15"/>
-        </w:rPr>
         <w:t>b, g, r = cv2.split(img)</w:t>
       </w:r>
+    </w:p>
+    <w:p>
+      <w:pPr>
+        <w:pStyle w:val="CodeBlock"/>
+        <w:keepNext/>
+        <w:keepLines/>
+      </w:pPr>
       <w:r>
-        <w:br/>
-      </w:r>
-      <w:r>
-        <w:rPr>
-          <w:rFonts w:ascii="Consolas" w:hAnsi="Consolas"/>
-          <w:color w:val="1C2B39"/>
-          <w:sz w:val="15"/>
-        </w:rPr>
         <w:t>result4 = cv2.merge([r, b, g])</w:t>
       </w:r>
+    </w:p>
+    <w:p>
+      <w:pPr>
+        <w:pStyle w:val="CodeBlock"/>
+        <w:keepNext/>
+        <w:keepLines/>
+      </w:pPr>
       <w:r>
-        <w:br/>
-      </w:r>
-      <w:r>
-        <w:rPr>
-          <w:rFonts w:ascii="Consolas" w:hAnsi="Consolas"/>
-          <w:color w:val="1C2B39"/>
-          <w:sz w:val="15"/>
-        </w:rPr>
         <w:t>cv2.imwrite("results/task4_channel_swap.png", result4)</w:t>
       </w:r>
+    </w:p>
+    <w:p>
+      <w:pPr>
+        <w:pStyle w:val="CodeBlock"/>
+        <w:keepNext/>
+        <w:keepLines/>
+      </w:pPr>
+    </w:p>
+    <w:p>
+      <w:pPr>
+        <w:pStyle w:val="CodeBlock"/>
+        <w:keepNext/>
+        <w:keepLines/>
+      </w:pPr>
       <w:r>
-        <w:br/>
-      </w:r>
-      <w:r>
-        <w:rPr>
-          <w:rFonts w:ascii="Consolas" w:hAnsi="Consolas"/>
-          <w:color w:val="1C2B39"/>
-          <w:sz w:val="15"/>
-        </w:rPr>
-        <w:t xml:space="preserve"> </w:t>
-      </w:r>
-      <w:r>
-        <w:br/>
-      </w:r>
-      <w:r>
-        <w:rPr>
-          <w:rFonts w:ascii="Consolas" w:hAnsi="Consolas"/>
-          <w:color w:val="1C2B39"/>
-          <w:sz w:val="15"/>
-        </w:rPr>
         <w:t>cv2_imshow(img)</w:t>
       </w:r>
+    </w:p>
+    <w:p>
+      <w:pPr>
+        <w:pStyle w:val="CodeBlock"/>
+        <w:keepLines/>
+        <w:spacing w:after="200"/>
+      </w:pPr>
       <w:r>
-        <w:br/>
-      </w:r>
-      <w:r>
-        <w:rPr>
-          <w:rFonts w:ascii="Consolas" w:hAnsi="Consolas"/>
-          <w:color w:val="1C2B39"/>
-          <w:sz w:val="15"/>
-        </w:rPr>
         <w:t>cv2_imshow(result4)</w:t>
       </w:r>
     </w:p>
     <w:p>
       <w:pPr>
         <w:pStyle w:val="Heading2"/>
-        <w:spacing w:before="120" w:after="80"/>
       </w:pPr>
       <w:r>
-        <w:rPr>
-          <w:rFonts w:ascii="Aptos Display" w:hAnsi="Aptos Display"/>
-          <w:color w:val="3D7E80"/>
-          <w:sz w:val="24"/>
-        </w:rPr>
-        <w:t>Output</w:t>
+        <w:t>6.4 Output</w:t>
       </w:r>
     </w:p>
     <w:p>
       <w:pPr>
         <w:keepNext/>
+        <w:spacing w:before="120" w:after="0"/>
         <w:jc w:val="center"/>
       </w:pPr>
       <w:r>
@@ -1525,7 +1440,7 @@
         </w:rPr>
         <w:drawing>
           <wp:inline distT="0" distB="0" distL="0" distR="0" wp14:anchorId="2818542A" wp14:editId="4861873B">
-            <wp:extent cx="6126480" cy="2150662"/>
+            <wp:extent cx="5943600" cy="2086463"/>
             <wp:effectExtent l="0" t="0" r="0" b="0"/>
             <wp:docPr id="4" name="Picture 4"/>
             <wp:cNvGraphicFramePr>
@@ -1539,7 +1454,7 @@
                     <pic:cNvPicPr/>
                   </pic:nvPicPr>
                   <pic:blipFill>
-                    <a:blip r:embed="rId11"/>
+                    <a:blip r:embed="rId12"/>
                     <a:stretch>
                       <a:fillRect/>
                     </a:stretch>
@@ -1547,7 +1462,7 @@
                   <pic:spPr>
                     <a:xfrm>
                       <a:off x="0" y="0"/>
-                      <a:ext cx="6126480" cy="2150662"/>
+                      <a:ext cx="5943600" cy="2086463"/>
                     </a:xfrm>
                     <a:prstGeom prst="rect">
                       <a:avLst/>
@@ -1562,40 +1477,31 @@
     </w:p>
     <w:p>
       <w:pPr>
-        <w:spacing w:after="80"/>
-        <w:jc w:val="center"/>
+        <w:pStyle w:val="Caption"/>
       </w:pPr>
       <w:r>
         <w:rPr>
-          <w:color w:val="536273"/>
-          <w:sz w:val="17"/>
+          <w:b/>
+          <w:bCs/>
+          <w:i w:val="0"/>
+          <w:iCs w:val="0"/>
+          <w:color w:val="1F3A5F"/>
         </w:rPr>
-        <w:t>Figure 4. Original zebra and the channel-swapped result.</w:t>
+        <w:t xml:space="preserve">Figure 4. </w:t>
+      </w:r>
+      <w:r>
+        <w:t>Original zebra and the channel-swapped result.</w:t>
       </w:r>
     </w:p>
     <w:p>
+      <w:pPr>
+        <w:pStyle w:val="Heading1"/>
+      </w:pPr>
       <w:r>
-        <w:br w:type="page"/>
+        <w:t>7. Conclusion</w:t>
       </w:r>
     </w:p>
     <w:p>
-      <w:pPr>
-        <w:pStyle w:val="Heading1"/>
-        <w:spacing w:before="200" w:after="80"/>
-      </w:pPr>
-      <w:r>
-        <w:rPr>
-          <w:rFonts w:ascii="Aptos Display" w:hAnsi="Aptos Display"/>
-          <w:sz w:val="32"/>
-        </w:rPr>
-        <w:lastRenderedPageBreak/>
-        <w:t>5. Conclusion</w:t>
-      </w:r>
-    </w:p>
-    <w:p>
-      <w:pPr>
-        <w:spacing w:after="100" w:line="259" w:lineRule="auto"/>
-      </w:pPr>
       <w:r>
         <w:t>The four exercises show how masks, channel values, weighted arithmetic, and Gaussian blur can produce distinct image effects. The final images demonstrate selective colour, a translucent overlay, a soft vignette, and a surreal channel rearrangement.</w:t>
       </w:r>
@@ -1603,37 +1509,38 @@
     <w:p>
       <w:pPr>
         <w:pStyle w:val="Heading1"/>
-        <w:spacing w:before="200" w:after="80"/>
       </w:pPr>
       <w:r>
-        <w:rPr>
-          <w:rFonts w:ascii="Aptos Display" w:hAnsi="Aptos Display"/>
-          <w:sz w:val="32"/>
-        </w:rPr>
-        <w:t>References</w:t>
+        <w:t>Links</w:t>
       </w:r>
     </w:p>
     <w:p>
       <w:pPr>
-        <w:spacing w:after="100" w:line="259" w:lineRule="auto"/>
+        <w:spacing w:after="80"/>
+        <w:ind w:left="480" w:hanging="480"/>
+        <w:jc w:val="left"/>
       </w:pPr>
       <w:r>
-        <w:t>CSE480/CSE482 Computer Vision Lab, Lab Assignment 01 task sheet, Ain Shams University Faculty of Engineering.</w:t>
+        <w:t xml:space="preserve">[1]  </w:t>
       </w:r>
-    </w:p>
-    <w:p>
-      <w:pPr>
-        <w:spacing w:after="100" w:line="259" w:lineRule="auto"/>
-      </w:pPr>
+      <w:hyperlink r:id="rId13" w:history="1">
+        <w:r>
+          <w:rPr>
+            <w:rStyle w:val="Hyperlink"/>
+          </w:rPr>
+          <w:t>https://github.com/KerolusHany/Computer-Vision-Course/tree/main/LAB%2001</w:t>
+        </w:r>
+      </w:hyperlink>
       <w:r>
-        <w:t>OpenCV documentation: https://docs.opencv.org/4.x/</w:t>
+        <w:t xml:space="preserve"> </w:t>
       </w:r>
     </w:p>
     <w:sectPr>
-      <w:headerReference w:type="default" r:id="rId12"/>
-      <w:footerReference w:type="default" r:id="rId13"/>
+      <w:headerReference w:type="default" r:id="rId14"/>
+      <w:footerReference w:type="default" r:id="rId15"/>
       <w:pgSz w:w="12240" w:h="15840"/>
-      <w:pgMar w:top="936" w:right="1008" w:bottom="936" w:left="1008" w:header="432" w:footer="432" w:gutter="0"/>
+      <w:pgMar w:top="1440" w:right="1440" w:bottom="1296" w:left="1440" w:header="640" w:footer="576" w:gutter="0"/>
+      <w:pgNumType w:start="1"/>
       <w:cols w:space="720"/>
       <w:docGrid w:linePitch="360"/>
     </w:sectPr>
@@ -1670,44 +1577,79 @@
 <w:ftr xmlns:wpc="http://schemas.microsoft.com/office/word/2010/wordprocessingCanvas" xmlns:cx="http://schemas.microsoft.com/office/drawing/2014/chartex" xmlns:cx1="http://schemas.microsoft.com/office/drawing/2015/9/8/chartex" xmlns:cx2="http://schemas.microsoft.com/office/drawing/2015/10/21/chartex" xmlns:cx3="http://schemas.microsoft.com/office/drawing/2016/5/9/chartex" xmlns:cx4="http://schemas.microsoft.com/office/drawing/2016/5/10/chartex" xmlns:cx5="http://schemas.microsoft.com/office/drawing/2016/5/11/chartex" xmlns:cx6="http://schemas.microsoft.com/office/drawing/2016/5/12/chartex" xmlns:cx7="http://schemas.microsoft.com/office/drawing/2016/5/13/chartex" xmlns:cx8="http://schemas.microsoft.com/office/drawing/2016/5/14/chartex" xmlns:mc="http://schemas.openxmlformats.org/markup-compatibility/2006" xmlns:aink="http://schemas.microsoft.com/office/drawing/2016/ink" xmlns:am3d="http://schemas.microsoft.com/office/drawing/2017/model3d" xmlns:o="urn:schemas-microsoft-com:office:office" xmlns:oel="http://schemas.microsoft.com/office/2019/extlst" xmlns:r="http://schemas.openxmlformats.org/officeDocument/2006/relationships" xmlns:m="http://schemas.openxmlformats.org/officeDocument/2006/math" xmlns:v="urn:schemas-microsoft-com:vml" xmlns:wp14="http://schemas.microsoft.com/office/word/2010/wordprocessingDrawing" xmlns:wp="http://schemas.openxmlformats.org/drawingml/2006/wordprocessingDrawing" xmlns:w10="urn:schemas-microsoft-com:office:word" xmlns:w="http://schemas.openxmlformats.org/wordprocessingml/2006/main" xmlns:w14="http://schemas.microsoft.com/office/word/2010/wordml" xmlns:w15="http://schemas.microsoft.com/office/word/2012/wordml" xmlns:w16cex="http://schemas.microsoft.com/office/word/2018/wordml/cex" xmlns:w16cid="http://schemas.microsoft.com/office/word/2016/wordml/cid" xmlns:w16="http://schemas.microsoft.com/office/word/2018/wordml" xmlns:w16du="http://schemas.microsoft.com/office/word/2023/wordml/word16du" xmlns:w16sdtdh="http://schemas.microsoft.com/office/word/2020/wordml/sdtdatahash" xmlns:w16sdtfl="http://schemas.microsoft.com/office/word/2024/wordml/sdtformatlock" xmlns:w16se="http://schemas.microsoft.com/office/word/2015/wordml/symex" xmlns:wpg="http://schemas.microsoft.com/office/word/2010/wordprocessingGroup" xmlns:wpi="http://schemas.microsoft.com/office/word/2010/wordprocessingInk" xmlns:wne="http://schemas.microsoft.com/office/word/2006/wordml" xmlns:wps="http://schemas.microsoft.com/office/word/2010/wordprocessingShape" mc:Ignorable="w14 w15 w16se w16cid w16 w16cex w16sdtdh w16sdtfl w16du wp14">
   <w:p>
     <w:pPr>
-      <w:pStyle w:val="Footer"/>
-      <w:jc w:val="right"/>
+      <w:pBdr>
+        <w:top w:val="single" w:sz="6" w:space="4" w:color="BFC8D2"/>
+      </w:pBdr>
+      <w:tabs>
+        <w:tab w:val="right" w:pos="9360"/>
+      </w:tabs>
+      <w:spacing w:after="0"/>
+      <w:jc w:val="left"/>
     </w:pPr>
     <w:r>
+      <w:rPr>
+        <w:color w:val="595959"/>
+        <w:sz w:val="18"/>
+      </w:rPr>
       <w:t>CSE480 / CSE</w:t>
     </w:r>
-    <w:proofErr w:type="gramStart"/>
     <w:r>
-      <w:t>482  •</w:t>
-    </w:r>
-    <w:proofErr w:type="gramEnd"/>
-    <w:r>
-      <w:t xml:space="preserve">  Lab Assignment </w:t>
-    </w:r>
-    <w:proofErr w:type="gramStart"/>
-    <w:r>
-      <w:t>01  •</w:t>
-    </w:r>
-    <w:proofErr w:type="gramEnd"/>
-    <w:r>
-      <w:t xml:space="preserve">  </w:t>
+      <w:rPr>
+        <w:color w:val="595959"/>
+        <w:sz w:val="18"/>
+      </w:rPr>
+      <w:t>482 | Mechatronics</w:t>
     </w:r>
     <w:r>
+      <w:rPr>
+        <w:color w:val="595959"/>
+        <w:sz w:val="18"/>
+      </w:rPr>
+      <w:t xml:space="preserve"> Engineering and Automation</w:t>
+    </w:r>
+    <w:r>
+      <w:tab/>
+    </w:r>
+    <w:r>
+      <w:rPr>
+        <w:color w:val="595959"/>
+        <w:sz w:val="18"/>
+      </w:rPr>
+      <w:t xml:space="preserve">Page </w:t>
+    </w:r>
+    <w:r>
+      <w:rPr>
+        <w:color w:val="595959"/>
+        <w:sz w:val="18"/>
+      </w:rPr>
       <w:fldChar w:fldCharType="begin"/>
     </w:r>
     <w:r>
-      <w:instrText>PAGE</w:instrText>
+      <w:rPr>
+        <w:color w:val="595959"/>
+        <w:sz w:val="18"/>
+      </w:rPr>
+      <w:instrText xml:space="preserve"> PAGE </w:instrText>
     </w:r>
     <w:r>
+      <w:rPr>
+        <w:color w:val="595959"/>
+        <w:sz w:val="18"/>
+      </w:rPr>
       <w:fldChar w:fldCharType="separate"/>
     </w:r>
     <w:r>
       <w:rPr>
-        <w:noProof/>
+        <w:color w:val="595959"/>
+        <w:sz w:val="18"/>
       </w:rPr>
       <w:t>1</w:t>
     </w:r>
     <w:r>
+      <w:rPr>
+        <w:color w:val="595959"/>
+        <w:sz w:val="18"/>
+      </w:rPr>
       <w:fldChar w:fldCharType="end"/>
     </w:r>
   </w:p>
@@ -1743,33 +1685,46 @@
 <w:hdr xmlns:wpc="http://schemas.microsoft.com/office/word/2010/wordprocessingCanvas" xmlns:cx="http://schemas.microsoft.com/office/drawing/2014/chartex" xmlns:cx1="http://schemas.microsoft.com/office/drawing/2015/9/8/chartex" xmlns:cx2="http://schemas.microsoft.com/office/drawing/2015/10/21/chartex" xmlns:cx3="http://schemas.microsoft.com/office/drawing/2016/5/9/chartex" xmlns:cx4="http://schemas.microsoft.com/office/drawing/2016/5/10/chartex" xmlns:cx5="http://schemas.microsoft.com/office/drawing/2016/5/11/chartex" xmlns:cx6="http://schemas.microsoft.com/office/drawing/2016/5/12/chartex" xmlns:cx7="http://schemas.microsoft.com/office/drawing/2016/5/13/chartex" xmlns:cx8="http://schemas.microsoft.com/office/drawing/2016/5/14/chartex" xmlns:mc="http://schemas.openxmlformats.org/markup-compatibility/2006" xmlns:aink="http://schemas.microsoft.com/office/drawing/2016/ink" xmlns:am3d="http://schemas.microsoft.com/office/drawing/2017/model3d" xmlns:o="urn:schemas-microsoft-com:office:office" xmlns:oel="http://schemas.microsoft.com/office/2019/extlst" xmlns:r="http://schemas.openxmlformats.org/officeDocument/2006/relationships" xmlns:m="http://schemas.openxmlformats.org/officeDocument/2006/math" xmlns:v="urn:schemas-microsoft-com:vml" xmlns:wp14="http://schemas.microsoft.com/office/word/2010/wordprocessingDrawing" xmlns:wp="http://schemas.openxmlformats.org/drawingml/2006/wordprocessingDrawing" xmlns:w10="urn:schemas-microsoft-com:office:word" xmlns:w="http://schemas.openxmlformats.org/wordprocessingml/2006/main" xmlns:w14="http://schemas.microsoft.com/office/word/2010/wordml" xmlns:w15="http://schemas.microsoft.com/office/word/2012/wordml" xmlns:w16cex="http://schemas.microsoft.com/office/word/2018/wordml/cex" xmlns:w16cid="http://schemas.microsoft.com/office/word/2016/wordml/cid" xmlns:w16="http://schemas.microsoft.com/office/word/2018/wordml" xmlns:w16du="http://schemas.microsoft.com/office/word/2023/wordml/word16du" xmlns:w16sdtdh="http://schemas.microsoft.com/office/word/2020/wordml/sdtdatahash" xmlns:w16sdtfl="http://schemas.microsoft.com/office/word/2024/wordml/sdtformatlock" xmlns:w16se="http://schemas.microsoft.com/office/word/2015/wordml/symex" xmlns:wpg="http://schemas.microsoft.com/office/word/2010/wordprocessingGroup" xmlns:wpi="http://schemas.microsoft.com/office/word/2010/wordprocessingInk" xmlns:wne="http://schemas.microsoft.com/office/word/2006/wordml" xmlns:wps="http://schemas.microsoft.com/office/word/2010/wordprocessingShape" mc:Ignorable="w14 w15 w16se w16cid w16 w16cex w16sdtdh w16sdtfl w16du wp14">
   <w:p>
     <w:pPr>
-      <w:pStyle w:val="Header"/>
+      <w:pBdr>
+        <w:bottom w:val="single" w:sz="6" w:space="4" w:color="BFC8D2"/>
+      </w:pBdr>
+      <w:tabs>
+        <w:tab w:val="right" w:pos="9360"/>
+      </w:tabs>
+      <w:spacing w:after="0"/>
+      <w:jc w:val="left"/>
     </w:pPr>
     <w:r>
       <w:rPr>
         <w:b/>
-        <w:color w:val="536273"/>
-        <w:sz w:val="16"/>
-      </w:rPr>
-      <w:t xml:space="preserve">AIN SHAMS </w:t>
+        <w:color w:val="595959"/>
+        <w:sz w:val="18"/>
+      </w:rPr>
+      <w:t>Computer Vision Lab Assignment 01</w:t>
     </w:r>
-    <w:proofErr w:type="gramStart"/>
     <w:r>
-      <w:rPr>
-        <w:b/>
-        <w:color w:val="536273"/>
-        <w:sz w:val="16"/>
-      </w:rPr>
-      <w:t>UNIVERSITY  |</w:t>
+      <w:tab/>
     </w:r>
-    <w:proofErr w:type="gramEnd"/>
     <w:r>
       <w:rPr>
-        <w:b/>
-        <w:color w:val="536273"/>
-        <w:sz w:val="16"/>
-      </w:rPr>
-      <w:t xml:space="preserve">  FACULTY OF ENGINEERING</w:t>
+        <w:color w:val="595959"/>
+        <w:sz w:val="18"/>
+      </w:rPr>
+      <w:t xml:space="preserve">Ain Shams </w:t>
+    </w:r>
+    <w:r>
+      <w:rPr>
+        <w:color w:val="595959"/>
+        <w:sz w:val="18"/>
+      </w:rPr>
+      <w:t>University | Faculty</w:t>
+    </w:r>
+    <w:r>
+      <w:rPr>
+        <w:color w:val="595959"/>
+        <w:sz w:val="18"/>
+      </w:rPr>
+      <w:t xml:space="preserve"> of Engineering</w:t>
     </w:r>
   </w:p>
 </w:hdr>
@@ -2367,11 +2322,13 @@
   <w:style w:type="paragraph" w:default="1" w:styleId="Normal">
     <w:name w:val="Normal"/>
     <w:qFormat/>
-    <w:rsid w:val="00FC693F"/>
+    <w:pPr>
+      <w:spacing w:after="120"/>
+      <w:jc w:val="both"/>
+    </w:pPr>
     <w:rPr>
-      <w:rFonts w:ascii="Aptos" w:hAnsi="Aptos"/>
-      <w:color w:val="263445"/>
-      <w:sz w:val="21"/>
+      <w:rFonts w:ascii="Calibri" w:eastAsia="Calibri" w:hAnsi="Calibri" w:cs="Calibri"/>
+      <w:color w:val="262626"/>
     </w:rPr>
   </w:style>
   <w:style w:type="paragraph" w:styleId="Heading1">
@@ -2381,20 +2338,22 @@
     <w:link w:val="Heading1Char"/>
     <w:uiPriority w:val="9"/>
     <w:qFormat/>
-    <w:rsid w:val="00FC693F"/>
     <w:pPr>
       <w:keepNext/>
       <w:keepLines/>
-      <w:spacing w:before="480" w:after="0"/>
+      <w:pBdr>
+        <w:bottom w:val="single" w:sz="8" w:space="4" w:color="1F3A5F"/>
+      </w:pBdr>
+      <w:spacing w:before="360" w:after="160" w:line="240" w:lineRule="auto"/>
+      <w:jc w:val="left"/>
       <w:outlineLvl w:val="0"/>
     </w:pPr>
     <w:rPr>
-      <w:rFonts w:asciiTheme="majorHAnsi" w:eastAsiaTheme="majorEastAsia" w:hAnsiTheme="majorHAnsi" w:cstheme="majorBidi"/>
       <w:b/>
       <w:bCs/>
       <w:color w:val="1F3A5F"/>
-      <w:sz w:val="28"/>
-      <w:szCs w:val="28"/>
+      <w:sz w:val="32"/>
+      <w:szCs w:val="32"/>
     </w:rPr>
   </w:style>
   <w:style w:type="paragraph" w:styleId="Heading2">
@@ -2405,18 +2364,17 @@
     <w:uiPriority w:val="9"/>
     <w:unhideWhenUsed/>
     <w:qFormat/>
-    <w:rsid w:val="00FC693F"/>
     <w:pPr>
       <w:keepNext/>
       <w:keepLines/>
-      <w:spacing w:before="200" w:after="0"/>
+      <w:spacing w:before="240" w:after="80" w:line="240" w:lineRule="auto"/>
+      <w:jc w:val="left"/>
       <w:outlineLvl w:val="1"/>
     </w:pPr>
     <w:rPr>
-      <w:rFonts w:asciiTheme="majorHAnsi" w:eastAsiaTheme="majorEastAsia" w:hAnsiTheme="majorHAnsi" w:cstheme="majorBidi"/>
       <w:b/>
       <w:bCs/>
-      <w:color w:val="1F3A5F"/>
+      <w:color w:val="2F5D8A"/>
       <w:sz w:val="26"/>
       <w:szCs w:val="26"/>
     </w:rPr>
@@ -2802,9 +2760,6 @@
     <w:uiPriority w:val="99"/>
     <w:unhideWhenUsed/>
     <w:rsid w:val="00AA1D8D"/>
-    <w:pPr>
-      <w:spacing w:after="120"/>
-    </w:pPr>
   </w:style>
   <w:style w:type="character" w:customStyle="1" w:styleId="BodyTextChar">
     <w:name w:val="Body Text Char"/>
@@ -2821,7 +2776,7 @@
     <w:unhideWhenUsed/>
     <w:rsid w:val="00AA1D8D"/>
     <w:pPr>
-      <w:spacing w:after="120" w:line="480" w:lineRule="auto"/>
+      <w:spacing w:line="480" w:lineRule="auto"/>
     </w:pPr>
   </w:style>
   <w:style w:type="character" w:customStyle="1" w:styleId="BodyText2Char">
@@ -2838,9 +2793,6 @@
     <w:uiPriority w:val="99"/>
     <w:unhideWhenUsed/>
     <w:rsid w:val="00AA1D8D"/>
-    <w:pPr>
-      <w:spacing w:after="120"/>
-    </w:pPr>
     <w:rPr>
       <w:sz w:val="16"/>
       <w:szCs w:val="16"/>
@@ -2975,7 +2927,6 @@
     <w:unhideWhenUsed/>
     <w:rsid w:val="0029639D"/>
     <w:pPr>
-      <w:spacing w:after="120"/>
       <w:ind w:left="360"/>
       <w:contextualSpacing/>
     </w:pPr>
@@ -2987,7 +2938,6 @@
     <w:unhideWhenUsed/>
     <w:rsid w:val="0029639D"/>
     <w:pPr>
-      <w:spacing w:after="120"/>
       <w:ind w:left="720"/>
       <w:contextualSpacing/>
     </w:pPr>
@@ -2999,7 +2949,6 @@
     <w:unhideWhenUsed/>
     <w:rsid w:val="0029639D"/>
     <w:pPr>
-      <w:spacing w:after="120"/>
       <w:ind w:left="1080"/>
       <w:contextualSpacing/>
     </w:pPr>
@@ -3156,19 +3105,18 @@
     <w:basedOn w:val="Normal"/>
     <w:next w:val="Normal"/>
     <w:uiPriority w:val="35"/>
-    <w:semiHidden/>
     <w:unhideWhenUsed/>
     <w:qFormat/>
-    <w:rsid w:val="00FC693F"/>
     <w:pPr>
-      <w:spacing w:line="240" w:lineRule="auto"/>
+      <w:spacing w:before="80" w:after="240" w:line="240" w:lineRule="auto"/>
+      <w:jc w:val="center"/>
     </w:pPr>
     <w:rPr>
-      <w:b/>
-      <w:bCs/>
-      <w:color w:val="4F81BD" w:themeColor="accent1"/>
-      <w:sz w:val="18"/>
-      <w:szCs w:val="18"/>
+      <w:i/>
+      <w:iCs/>
+      <w:color w:val="595959"/>
+      <w:sz w:val="19"/>
+      <w:szCs w:val="19"/>
     </w:rPr>
   </w:style>
   <w:style w:type="character" w:styleId="Strong">
@@ -13362,6 +13310,60 @@
         <w:shd w:val="clear" w:color="auto" w:fill="FBCAA2" w:themeFill="accent6" w:themeFillTint="7F"/>
       </w:tcPr>
     </w:tblStylePr>
+  </w:style>
+  <w:style w:type="paragraph" w:customStyle="1" w:styleId="CodeBlock">
+    <w:name w:val="Code Block"/>
+    <w:basedOn w:val="Normal"/>
+    <w:qFormat/>
+    <w:pPr>
+      <w:pBdr>
+        <w:left w:val="single" w:sz="24" w:space="8" w:color="2F5D8A"/>
+      </w:pBdr>
+      <w:shd w:val="clear" w:color="auto" w:fill="F4F6F8"/>
+      <w:spacing w:after="0" w:line="252" w:lineRule="auto"/>
+      <w:ind w:left="240" w:right="120"/>
+      <w:jc w:val="left"/>
+    </w:pPr>
+    <w:rPr>
+      <w:rFonts w:ascii="Consolas" w:hAnsi="Consolas" w:cs="Consolas"/>
+      <w:color w:val="1C2B39"/>
+      <w:sz w:val="17"/>
+      <w:szCs w:val="17"/>
+    </w:rPr>
+  </w:style>
+  <w:style w:type="character" w:customStyle="1" w:styleId="InlineCode">
+    <w:name w:val="Inline Code"/>
+    <w:uiPriority w:val="1"/>
+    <w:qFormat/>
+    <w:rPr>
+      <w:rFonts w:ascii="Consolas" w:hAnsi="Consolas" w:cs="Consolas"/>
+      <w:color w:val="1F3A5F"/>
+      <w:sz w:val="20"/>
+      <w:szCs w:val="20"/>
+    </w:rPr>
+  </w:style>
+  <w:style w:type="character" w:styleId="Hyperlink">
+    <w:name w:val="Hyperlink"/>
+    <w:basedOn w:val="DefaultParagraphFont"/>
+    <w:uiPriority w:val="99"/>
+    <w:unhideWhenUsed/>
+    <w:rsid w:val="00E64E7D"/>
+    <w:rPr>
+      <w:color w:val="0000FF" w:themeColor="hyperlink"/>
+      <w:u w:val="single"/>
+    </w:rPr>
+  </w:style>
+  <w:style w:type="character" w:styleId="UnresolvedMention">
+    <w:name w:val="Unresolved Mention"/>
+    <w:basedOn w:val="DefaultParagraphFont"/>
+    <w:uiPriority w:val="99"/>
+    <w:semiHidden/>
+    <w:unhideWhenUsed/>
+    <w:rsid w:val="00E64E7D"/>
+    <w:rPr>
+      <w:color w:val="605E5C"/>
+      <w:shd w:val="clear" w:color="auto" w:fill="E1DFDD"/>
+    </w:rPr>
   </w:style>
 </w:styles>
 </file>

</xml_diff>

<commit_message>
Add PDF copy of Lab 01 report
</commit_message>
<xml_diff>
--- a/LAB 01/Lab01_Computer_Vision_Report.docx
+++ b/LAB 01/Lab01_Computer_Vision_Report.docx
@@ -12,25 +12,17 @@
           <w:noProof/>
         </w:rPr>
         <w:drawing>
-          <wp:anchor distT="0" distB="0" distL="114300" distR="114300" simplePos="0" relativeHeight="251658240" behindDoc="1" locked="0" layoutInCell="1" allowOverlap="1" wp14:anchorId="65C06192" wp14:editId="74D7741F">
+          <wp:anchor distT="0" distB="0" distL="114300" distR="114300" simplePos="0" relativeHeight="251658240" behindDoc="0" locked="0" layoutInCell="1" allowOverlap="1" wp14:anchorId="65C06192" wp14:editId="623C8051">
             <wp:simplePos x="0" y="0"/>
             <wp:positionH relativeFrom="column">
-              <wp:posOffset>2200275</wp:posOffset>
+              <wp:posOffset>2276475</wp:posOffset>
             </wp:positionH>
             <wp:positionV relativeFrom="paragraph">
-              <wp:posOffset>-657225</wp:posOffset>
+              <wp:posOffset>-638175</wp:posOffset>
             </wp:positionV>
             <wp:extent cx="1543050" cy="1465580"/>
             <wp:effectExtent l="0" t="0" r="0" b="1270"/>
-            <wp:wrapTight wrapText="bothSides">
-              <wp:wrapPolygon edited="0">
-                <wp:start x="0" y="0"/>
-                <wp:lineTo x="0" y="21338"/>
-                <wp:lineTo x="21333" y="21338"/>
-                <wp:lineTo x="21333" y="0"/>
-                <wp:lineTo x="0" y="0"/>
-              </wp:wrapPolygon>
-            </wp:wrapTight>
+            <wp:wrapNone/>
             <wp:docPr id="1281400099" name="Picture 1"/>
             <wp:cNvGraphicFramePr>
               <a:graphicFrameLocks xmlns:a="http://schemas.openxmlformats.org/drawingml/2006/main" noChangeAspect="1"/>
@@ -13365,6 +13357,18 @@
       <w:shd w:val="clear" w:color="auto" w:fill="E1DFDD"/>
     </w:rPr>
   </w:style>
+  <w:style w:type="character" w:styleId="FollowedHyperlink">
+    <w:name w:val="FollowedHyperlink"/>
+    <w:basedOn w:val="DefaultParagraphFont"/>
+    <w:uiPriority w:val="99"/>
+    <w:semiHidden/>
+    <w:unhideWhenUsed/>
+    <w:rsid w:val="00057051"/>
+    <w:rPr>
+      <w:color w:val="800080" w:themeColor="followedHyperlink"/>
+      <w:u w:val="single"/>
+    </w:rPr>
+  </w:style>
 </w:styles>
 </file>
 

</xml_diff>